<commit_message>
email analysis room case
</commit_message>
<xml_diff>
--- a/public/Assets/Cases/SOC342/AhmedEmad_SOC342.docx
+++ b/public/Assets/Cases/SOC342/AhmedEmad_SOC342.docx
@@ -6,7 +6,7 @@
       <w:pPr>
         <w:spacing w:after="0"/>
         <w:rPr>
-          <w:rFonts w:ascii="Century Gothic" w:hAnsi="Century Gothic"/>
+          <w:rFonts w:cstheme="minorHAnsi"/>
           <w:sz w:val="16"/>
           <w:szCs w:val="16"/>
         </w:rPr>
@@ -49,7 +49,7 @@
               <w:pStyle w:val="p1"/>
               <w:jc w:val="center"/>
               <w:rPr>
-                <w:rFonts w:ascii="Century Gothic" w:hAnsi="Century Gothic"/>
+                <w:rFonts w:asciiTheme="minorHAnsi" w:hAnsiTheme="minorHAnsi" w:cstheme="minorHAnsi"/>
                 <w:b/>
                 <w:bCs/>
                 <w:color w:val="auto"/>
@@ -58,7 +58,7 @@
             </w:pPr>
             <w:r>
               <w:rPr>
-                <w:rFonts w:ascii="Century Gothic" w:hAnsi="Century Gothic"/>
+                <w:rFonts w:asciiTheme="minorHAnsi" w:hAnsiTheme="minorHAnsi" w:cstheme="minorHAnsi"/>
                 <w:b/>
                 <w:bCs/>
                 <w:color w:val="auto"/>
@@ -81,7 +81,7 @@
             <w:pPr>
               <w:pStyle w:val="p1"/>
               <w:rPr>
-                <w:rFonts w:ascii="Century Gothic" w:hAnsi="Century Gothic"/>
+                <w:rFonts w:asciiTheme="minorHAnsi" w:hAnsiTheme="minorHAnsi" w:cstheme="minorHAnsi"/>
                 <w:b/>
                 <w:bCs/>
                 <w:color w:val="3B3838" w:themeColor="background2" w:themeShade="40"/>
@@ -90,36 +90,14 @@
             </w:pPr>
             <w:r>
               <w:rPr>
-                <w:rFonts w:ascii="Century Gothic" w:hAnsi="Century Gothic"/>
+                <w:rFonts w:asciiTheme="minorHAnsi" w:hAnsiTheme="minorHAnsi" w:cstheme="minorHAnsi"/>
                 <w:b/>
                 <w:bCs/>
                 <w:color w:val="3B3838" w:themeColor="background2" w:themeShade="40"/>
                 <w:sz w:val="20"/>
                 <w:szCs w:val="18"/>
               </w:rPr>
-              <w:t xml:space="preserve">Full </w:t>
-            </w:r>
-            <w:r>
-              <w:rPr>
-                <w:rFonts w:ascii="Century Gothic" w:hAnsi="Century Gothic"/>
-                <w:b/>
-                <w:bCs/>
-                <w:color w:val="3B3838" w:themeColor="background2" w:themeShade="40"/>
-                <w:sz w:val="20"/>
-                <w:szCs w:val="18"/>
-              </w:rPr>
-              <w:t>n</w:t>
-            </w:r>
-            <w:r>
-              <w:rPr>
-                <w:rFonts w:ascii="Century Gothic" w:hAnsi="Century Gothic"/>
-                <w:b/>
-                <w:bCs/>
-                <w:color w:val="3B3838" w:themeColor="background2" w:themeShade="40"/>
-                <w:sz w:val="20"/>
-                <w:szCs w:val="18"/>
-              </w:rPr>
-              <w:t>ame</w:t>
+              <w:t>Full name</w:t>
             </w:r>
           </w:p>
         </w:tc>
@@ -132,7 +110,7 @@
             <w:pPr>
               <w:pStyle w:val="p1"/>
               <w:rPr>
-                <w:rFonts w:ascii="Century Gothic" w:hAnsi="Century Gothic"/>
+                <w:rFonts w:asciiTheme="minorHAnsi" w:hAnsiTheme="minorHAnsi" w:cstheme="minorHAnsi"/>
                 <w:b/>
                 <w:bCs/>
                 <w:color w:val="3B3838" w:themeColor="background2" w:themeShade="40"/>
@@ -150,7 +128,7 @@
             <w:pPr>
               <w:pStyle w:val="p1"/>
               <w:rPr>
-                <w:rFonts w:ascii="Century Gothic" w:hAnsi="Century Gothic"/>
+                <w:rFonts w:asciiTheme="minorHAnsi" w:hAnsiTheme="minorHAnsi" w:cstheme="minorHAnsi"/>
                 <w:b/>
                 <w:bCs/>
                 <w:color w:val="3B3838" w:themeColor="background2" w:themeShade="40"/>
@@ -159,53 +137,13 @@
             </w:pPr>
             <w:r>
               <w:rPr>
-                <w:rFonts w:ascii="Century Gothic" w:hAnsi="Century Gothic"/>
+                <w:rFonts w:asciiTheme="minorHAnsi" w:hAnsiTheme="minorHAnsi" w:cstheme="minorHAnsi"/>
                 <w:b/>
                 <w:bCs/>
                 <w:color w:val="3B3838" w:themeColor="background2" w:themeShade="40"/>
                 <w:sz w:val="20"/>
               </w:rPr>
-              <w:t xml:space="preserve">Job </w:t>
-            </w:r>
-            <w:r>
-              <w:rPr>
-                <w:rFonts w:ascii="Century Gothic" w:hAnsi="Century Gothic"/>
-                <w:b/>
-                <w:bCs/>
-                <w:color w:val="3B3838" w:themeColor="background2" w:themeShade="40"/>
-                <w:sz w:val="20"/>
-              </w:rPr>
-              <w:t>t</w:t>
-            </w:r>
-            <w:r>
-              <w:rPr>
-                <w:rFonts w:ascii="Century Gothic" w:hAnsi="Century Gothic"/>
-                <w:b/>
-                <w:bCs/>
-                <w:color w:val="3B3838" w:themeColor="background2" w:themeShade="40"/>
-                <w:sz w:val="20"/>
-              </w:rPr>
-              <w:t xml:space="preserve">itle / </w:t>
-            </w:r>
-            <w:r>
-              <w:rPr>
-                <w:rFonts w:ascii="Century Gothic" w:hAnsi="Century Gothic"/>
-                <w:b/>
-                <w:bCs/>
-                <w:color w:val="3B3838" w:themeColor="background2" w:themeShade="40"/>
-                <w:sz w:val="20"/>
-              </w:rPr>
-              <w:t>r</w:t>
-            </w:r>
-            <w:r>
-              <w:rPr>
-                <w:rFonts w:ascii="Century Gothic" w:hAnsi="Century Gothic"/>
-                <w:b/>
-                <w:bCs/>
-                <w:color w:val="3B3838" w:themeColor="background2" w:themeShade="40"/>
-                <w:sz w:val="20"/>
-              </w:rPr>
-              <w:t>ole</w:t>
+              <w:t>Job title / role</w:t>
             </w:r>
           </w:p>
         </w:tc>
@@ -227,15 +165,15 @@
             <w:pPr>
               <w:pStyle w:val="p1"/>
               <w:rPr>
-                <w:rFonts w:ascii="Century Gothic" w:hAnsi="Century Gothic"/>
-                <w:color w:val="auto"/>
-                <w:sz w:val="20"/>
-                <w:szCs w:val="18"/>
-              </w:rPr>
-            </w:pPr>
-            <w:r>
-              <w:rPr>
-                <w:rFonts w:ascii="Century Gothic" w:hAnsi="Century Gothic"/>
+                <w:rFonts w:asciiTheme="minorHAnsi" w:hAnsiTheme="minorHAnsi" w:cstheme="minorHAnsi"/>
+                <w:color w:val="auto"/>
+                <w:sz w:val="20"/>
+                <w:szCs w:val="18"/>
+              </w:rPr>
+            </w:pPr>
+            <w:r>
+              <w:rPr>
+                <w:rFonts w:asciiTheme="minorHAnsi" w:hAnsiTheme="minorHAnsi" w:cstheme="minorHAnsi"/>
                 <w:color w:val="auto"/>
                 <w:sz w:val="20"/>
                 <w:szCs w:val="18"/>
@@ -253,7 +191,7 @@
             <w:pPr>
               <w:pStyle w:val="p1"/>
               <w:rPr>
-                <w:rFonts w:ascii="Century Gothic" w:hAnsi="Century Gothic"/>
+                <w:rFonts w:asciiTheme="minorHAnsi" w:hAnsiTheme="minorHAnsi" w:cstheme="minorHAnsi"/>
                 <w:color w:val="auto"/>
                 <w:sz w:val="20"/>
                 <w:szCs w:val="18"/>
@@ -274,15 +212,15 @@
             <w:pPr>
               <w:pStyle w:val="p1"/>
               <w:rPr>
-                <w:rFonts w:ascii="Century Gothic" w:hAnsi="Century Gothic"/>
-                <w:color w:val="auto"/>
-                <w:sz w:val="20"/>
-                <w:szCs w:val="18"/>
-              </w:rPr>
-            </w:pPr>
-            <w:r>
-              <w:rPr>
-                <w:rFonts w:ascii="Century Gothic" w:hAnsi="Century Gothic"/>
+                <w:rFonts w:asciiTheme="minorHAnsi" w:hAnsiTheme="minorHAnsi" w:cstheme="minorHAnsi"/>
+                <w:color w:val="auto"/>
+                <w:sz w:val="20"/>
+                <w:szCs w:val="18"/>
+              </w:rPr>
+            </w:pPr>
+            <w:r>
+              <w:rPr>
+                <w:rFonts w:asciiTheme="minorHAnsi" w:hAnsiTheme="minorHAnsi" w:cstheme="minorHAnsi"/>
                 <w:color w:val="auto"/>
                 <w:sz w:val="20"/>
                 <w:szCs w:val="18"/>
@@ -308,7 +246,7 @@
             <w:pPr>
               <w:pStyle w:val="p1"/>
               <w:rPr>
-                <w:rFonts w:ascii="Century Gothic" w:hAnsi="Century Gothic"/>
+                <w:rFonts w:asciiTheme="minorHAnsi" w:hAnsiTheme="minorHAnsi" w:cstheme="minorHAnsi"/>
                 <w:b/>
                 <w:bCs/>
                 <w:color w:val="3B3838" w:themeColor="background2" w:themeShade="40"/>
@@ -317,36 +255,14 @@
             </w:pPr>
             <w:r>
               <w:rPr>
-                <w:rFonts w:ascii="Century Gothic" w:hAnsi="Century Gothic"/>
+                <w:rFonts w:asciiTheme="minorHAnsi" w:hAnsiTheme="minorHAnsi" w:cstheme="minorHAnsi"/>
                 <w:b/>
                 <w:bCs/>
                 <w:color w:val="3B3838" w:themeColor="background2" w:themeShade="40"/>
                 <w:sz w:val="20"/>
                 <w:szCs w:val="20"/>
               </w:rPr>
-              <w:t xml:space="preserve">Department / </w:t>
-            </w:r>
-            <w:r>
-              <w:rPr>
-                <w:rFonts w:ascii="Century Gothic" w:hAnsi="Century Gothic"/>
-                <w:b/>
-                <w:bCs/>
-                <w:color w:val="3B3838" w:themeColor="background2" w:themeShade="40"/>
-                <w:sz w:val="20"/>
-                <w:szCs w:val="20"/>
-              </w:rPr>
-              <w:t>t</w:t>
-            </w:r>
-            <w:r>
-              <w:rPr>
-                <w:rFonts w:ascii="Century Gothic" w:hAnsi="Century Gothic"/>
-                <w:b/>
-                <w:bCs/>
-                <w:color w:val="3B3838" w:themeColor="background2" w:themeShade="40"/>
-                <w:sz w:val="20"/>
-                <w:szCs w:val="20"/>
-              </w:rPr>
-              <w:t>eam</w:t>
+              <w:t>Department / team</w:t>
             </w:r>
           </w:p>
         </w:tc>
@@ -359,7 +275,7 @@
             <w:pPr>
               <w:pStyle w:val="p1"/>
               <w:rPr>
-                <w:rFonts w:ascii="Century Gothic" w:hAnsi="Century Gothic"/>
+                <w:rFonts w:asciiTheme="minorHAnsi" w:hAnsiTheme="minorHAnsi" w:cstheme="minorHAnsi"/>
                 <w:b/>
                 <w:bCs/>
                 <w:color w:val="3B3838" w:themeColor="background2" w:themeShade="40"/>
@@ -380,7 +296,7 @@
             <w:pPr>
               <w:pStyle w:val="p1"/>
               <w:rPr>
-                <w:rFonts w:ascii="Century Gothic" w:hAnsi="Century Gothic"/>
+                <w:rFonts w:asciiTheme="minorHAnsi" w:hAnsiTheme="minorHAnsi" w:cstheme="minorHAnsi"/>
                 <w:b/>
                 <w:bCs/>
                 <w:color w:val="3B3838" w:themeColor="background2" w:themeShade="40"/>
@@ -389,36 +305,14 @@
             </w:pPr>
             <w:r>
               <w:rPr>
-                <w:rFonts w:ascii="Century Gothic" w:hAnsi="Century Gothic"/>
+                <w:rFonts w:asciiTheme="minorHAnsi" w:hAnsiTheme="minorHAnsi" w:cstheme="minorHAnsi"/>
                 <w:b/>
                 <w:bCs/>
                 <w:color w:val="3B3838" w:themeColor="background2" w:themeShade="40"/>
                 <w:sz w:val="20"/>
                 <w:szCs w:val="20"/>
               </w:rPr>
-              <w:t xml:space="preserve">Email </w:t>
-            </w:r>
-            <w:r>
-              <w:rPr>
-                <w:rFonts w:ascii="Century Gothic" w:hAnsi="Century Gothic"/>
-                <w:b/>
-                <w:bCs/>
-                <w:color w:val="3B3838" w:themeColor="background2" w:themeShade="40"/>
-                <w:sz w:val="20"/>
-                <w:szCs w:val="20"/>
-              </w:rPr>
-              <w:t>a</w:t>
-            </w:r>
-            <w:r>
-              <w:rPr>
-                <w:rFonts w:ascii="Century Gothic" w:hAnsi="Century Gothic"/>
-                <w:b/>
-                <w:bCs/>
-                <w:color w:val="3B3838" w:themeColor="background2" w:themeShade="40"/>
-                <w:sz w:val="20"/>
-                <w:szCs w:val="20"/>
-              </w:rPr>
-              <w:t>ddress</w:t>
+              <w:t>Email address</w:t>
             </w:r>
           </w:p>
         </w:tc>
@@ -440,15 +334,15 @@
             <w:pPr>
               <w:pStyle w:val="p1"/>
               <w:rPr>
-                <w:rFonts w:ascii="Century Gothic" w:hAnsi="Century Gothic"/>
-                <w:color w:val="auto"/>
-                <w:sz w:val="20"/>
-                <w:szCs w:val="18"/>
-              </w:rPr>
-            </w:pPr>
-            <w:r>
-              <w:rPr>
-                <w:rFonts w:ascii="Century Gothic" w:hAnsi="Century Gothic"/>
+                <w:rFonts w:asciiTheme="minorHAnsi" w:hAnsiTheme="minorHAnsi" w:cstheme="minorHAnsi"/>
+                <w:color w:val="auto"/>
+                <w:sz w:val="20"/>
+                <w:szCs w:val="18"/>
+              </w:rPr>
+            </w:pPr>
+            <w:r>
+              <w:rPr>
+                <w:rFonts w:asciiTheme="minorHAnsi" w:hAnsiTheme="minorHAnsi" w:cstheme="minorHAnsi"/>
                 <w:color w:val="auto"/>
                 <w:sz w:val="20"/>
                 <w:szCs w:val="18"/>
@@ -466,7 +360,7 @@
             <w:pPr>
               <w:pStyle w:val="p1"/>
               <w:rPr>
-                <w:rFonts w:ascii="Century Gothic" w:hAnsi="Century Gothic"/>
+                <w:rFonts w:asciiTheme="minorHAnsi" w:hAnsiTheme="minorHAnsi" w:cstheme="minorHAnsi"/>
                 <w:color w:val="auto"/>
                 <w:sz w:val="20"/>
                 <w:szCs w:val="18"/>
@@ -487,15 +381,15 @@
             <w:pPr>
               <w:pStyle w:val="p1"/>
               <w:rPr>
-                <w:rFonts w:ascii="Century Gothic" w:hAnsi="Century Gothic"/>
-                <w:color w:val="auto"/>
-                <w:sz w:val="20"/>
-                <w:szCs w:val="18"/>
-              </w:rPr>
-            </w:pPr>
-            <w:r>
-              <w:rPr>
-                <w:rFonts w:ascii="Century Gothic" w:hAnsi="Century Gothic"/>
+                <w:rFonts w:asciiTheme="minorHAnsi" w:hAnsiTheme="minorHAnsi" w:cstheme="minorHAnsi"/>
+                <w:color w:val="auto"/>
+                <w:sz w:val="20"/>
+                <w:szCs w:val="18"/>
+              </w:rPr>
+            </w:pPr>
+            <w:r>
+              <w:rPr>
+                <w:rFonts w:asciiTheme="minorHAnsi" w:hAnsiTheme="minorHAnsi" w:cstheme="minorHAnsi"/>
                 <w:color w:val="auto"/>
                 <w:sz w:val="20"/>
                 <w:szCs w:val="18"/>
@@ -521,7 +415,7 @@
             <w:pPr>
               <w:pStyle w:val="p1"/>
               <w:rPr>
-                <w:rFonts w:ascii="Century Gothic" w:hAnsi="Century Gothic"/>
+                <w:rFonts w:asciiTheme="minorHAnsi" w:hAnsiTheme="minorHAnsi" w:cstheme="minorHAnsi"/>
                 <w:b/>
                 <w:bCs/>
                 <w:color w:val="3B3838" w:themeColor="background2" w:themeShade="40"/>
@@ -530,36 +424,14 @@
             </w:pPr>
             <w:r>
               <w:rPr>
-                <w:rFonts w:ascii="Century Gothic" w:hAnsi="Century Gothic"/>
+                <w:rFonts w:asciiTheme="minorHAnsi" w:hAnsiTheme="minorHAnsi" w:cstheme="minorHAnsi"/>
                 <w:b/>
                 <w:bCs/>
                 <w:color w:val="3B3838" w:themeColor="background2" w:themeShade="40"/>
                 <w:sz w:val="20"/>
                 <w:szCs w:val="20"/>
               </w:rPr>
-              <w:t xml:space="preserve">Phone </w:t>
-            </w:r>
-            <w:r>
-              <w:rPr>
-                <w:rFonts w:ascii="Century Gothic" w:hAnsi="Century Gothic"/>
-                <w:b/>
-                <w:bCs/>
-                <w:color w:val="3B3838" w:themeColor="background2" w:themeShade="40"/>
-                <w:sz w:val="20"/>
-                <w:szCs w:val="20"/>
-              </w:rPr>
-              <w:t>n</w:t>
-            </w:r>
-            <w:r>
-              <w:rPr>
-                <w:rFonts w:ascii="Century Gothic" w:hAnsi="Century Gothic"/>
-                <w:b/>
-                <w:bCs/>
-                <w:color w:val="3B3838" w:themeColor="background2" w:themeShade="40"/>
-                <w:sz w:val="20"/>
-                <w:szCs w:val="20"/>
-              </w:rPr>
-              <w:t>umber</w:t>
+              <w:t>Phone number</w:t>
             </w:r>
           </w:p>
         </w:tc>
@@ -572,7 +444,7 @@
             <w:pPr>
               <w:pStyle w:val="p1"/>
               <w:rPr>
-                <w:rFonts w:ascii="Century Gothic" w:hAnsi="Century Gothic"/>
+                <w:rFonts w:asciiTheme="minorHAnsi" w:hAnsiTheme="minorHAnsi" w:cstheme="minorHAnsi"/>
                 <w:b/>
                 <w:bCs/>
                 <w:color w:val="3B3838" w:themeColor="background2" w:themeShade="40"/>
@@ -593,7 +465,7 @@
             <w:pPr>
               <w:pStyle w:val="p1"/>
               <w:rPr>
-                <w:rFonts w:ascii="Century Gothic" w:hAnsi="Century Gothic"/>
+                <w:rFonts w:asciiTheme="minorHAnsi" w:hAnsiTheme="minorHAnsi" w:cstheme="minorHAnsi"/>
                 <w:b/>
                 <w:bCs/>
                 <w:color w:val="3B3838" w:themeColor="background2" w:themeShade="40"/>
@@ -620,15 +492,15 @@
             <w:pPr>
               <w:pStyle w:val="p1"/>
               <w:rPr>
-                <w:rFonts w:ascii="Century Gothic" w:hAnsi="Century Gothic"/>
-                <w:color w:val="auto"/>
-                <w:sz w:val="20"/>
-                <w:szCs w:val="18"/>
-              </w:rPr>
-            </w:pPr>
-            <w:r>
-              <w:rPr>
-                <w:rFonts w:ascii="Century Gothic" w:hAnsi="Century Gothic"/>
+                <w:rFonts w:asciiTheme="minorHAnsi" w:hAnsiTheme="minorHAnsi" w:cstheme="minorHAnsi"/>
+                <w:color w:val="auto"/>
+                <w:sz w:val="20"/>
+                <w:szCs w:val="18"/>
+              </w:rPr>
+            </w:pPr>
+            <w:r>
+              <w:rPr>
+                <w:rFonts w:asciiTheme="minorHAnsi" w:hAnsiTheme="minorHAnsi" w:cstheme="minorHAnsi"/>
                 <w:color w:val="auto"/>
                 <w:sz w:val="20"/>
                 <w:szCs w:val="18"/>
@@ -646,7 +518,7 @@
             <w:pPr>
               <w:pStyle w:val="p1"/>
               <w:rPr>
-                <w:rFonts w:ascii="Century Gothic" w:hAnsi="Century Gothic"/>
+                <w:rFonts w:asciiTheme="minorHAnsi" w:hAnsiTheme="minorHAnsi" w:cstheme="minorHAnsi"/>
                 <w:color w:val="auto"/>
                 <w:sz w:val="20"/>
                 <w:szCs w:val="18"/>
@@ -663,7 +535,7 @@
             <w:pPr>
               <w:pStyle w:val="p1"/>
               <w:rPr>
-                <w:rFonts w:ascii="Century Gothic" w:hAnsi="Century Gothic"/>
+                <w:rFonts w:asciiTheme="minorHAnsi" w:hAnsiTheme="minorHAnsi" w:cstheme="minorHAnsi"/>
                 <w:color w:val="auto"/>
                 <w:sz w:val="20"/>
                 <w:szCs w:val="18"/>
@@ -677,7 +549,7 @@
       <w:pPr>
         <w:spacing w:after="0"/>
         <w:rPr>
-          <w:rFonts w:ascii="Century Gothic" w:hAnsi="Century Gothic"/>
+          <w:rFonts w:cstheme="minorHAnsi"/>
           <w:sz w:val="16"/>
           <w:szCs w:val="16"/>
         </w:rPr>
@@ -720,7 +592,7 @@
               <w:pStyle w:val="p1"/>
               <w:jc w:val="center"/>
               <w:rPr>
-                <w:rFonts w:ascii="Century Gothic" w:hAnsi="Century Gothic"/>
+                <w:rFonts w:asciiTheme="minorHAnsi" w:hAnsiTheme="minorHAnsi" w:cstheme="minorHAnsi"/>
                 <w:b/>
                 <w:bCs/>
                 <w:color w:val="auto"/>
@@ -729,7 +601,7 @@
             </w:pPr>
             <w:r>
               <w:rPr>
-                <w:rFonts w:ascii="Century Gothic" w:hAnsi="Century Gothic"/>
+                <w:rFonts w:asciiTheme="minorHAnsi" w:hAnsiTheme="minorHAnsi" w:cstheme="minorHAnsi"/>
                 <w:b/>
                 <w:bCs/>
                 <w:color w:val="auto"/>
@@ -753,16 +625,16 @@
             <w:pPr>
               <w:pStyle w:val="p1"/>
               <w:rPr>
-                <w:rFonts w:ascii="Century Gothic" w:hAnsi="Century Gothic"/>
-                <w:b/>
-                <w:bCs/>
-                <w:color w:val="auto"/>
-                <w:sz w:val="20"/>
-              </w:rPr>
-            </w:pPr>
-            <w:r>
-              <w:rPr>
-                <w:rFonts w:ascii="Century Gothic" w:hAnsi="Century Gothic"/>
+                <w:rFonts w:asciiTheme="minorHAnsi" w:hAnsiTheme="minorHAnsi" w:cstheme="minorHAnsi"/>
+                <w:b/>
+                <w:bCs/>
+                <w:color w:val="auto"/>
+                <w:sz w:val="20"/>
+              </w:rPr>
+            </w:pPr>
+            <w:r>
+              <w:rPr>
+                <w:rFonts w:asciiTheme="minorHAnsi" w:hAnsiTheme="minorHAnsi" w:cstheme="minorHAnsi"/>
                 <w:b/>
                 <w:bCs/>
                 <w:color w:val="auto"/>
@@ -773,7 +645,7 @@
             </w:r>
             <w:r>
               <w:rPr>
-                <w:rFonts w:ascii="Century Gothic" w:hAnsi="Century Gothic"/>
+                <w:rFonts w:asciiTheme="minorHAnsi" w:hAnsiTheme="minorHAnsi" w:cstheme="minorHAnsi"/>
                 <w:b/>
                 <w:bCs/>
                 <w:color w:val="auto"/>
@@ -784,7 +656,7 @@
             </w:r>
             <w:r>
               <w:rPr>
-                <w:rFonts w:ascii="Century Gothic" w:hAnsi="Century Gothic"/>
+                <w:rFonts w:asciiTheme="minorHAnsi" w:hAnsiTheme="minorHAnsi" w:cstheme="minorHAnsi"/>
                 <w:b/>
                 <w:bCs/>
                 <w:color w:val="auto"/>
@@ -795,7 +667,7 @@
             </w:r>
             <w:r>
               <w:rPr>
-                <w:rFonts w:ascii="Century Gothic" w:hAnsi="Century Gothic"/>
+                <w:rFonts w:asciiTheme="minorHAnsi" w:hAnsiTheme="minorHAnsi" w:cstheme="minorHAnsi"/>
                 <w:b/>
                 <w:bCs/>
                 <w:color w:val="auto"/>
@@ -806,7 +678,7 @@
             </w:r>
             <w:r>
               <w:rPr>
-                <w:rFonts w:ascii="Century Gothic" w:hAnsi="Century Gothic"/>
+                <w:rFonts w:asciiTheme="minorHAnsi" w:hAnsiTheme="minorHAnsi" w:cstheme="minorHAnsi"/>
                 <w:b/>
                 <w:bCs/>
                 <w:color w:val="auto"/>
@@ -817,7 +689,7 @@
             </w:r>
             <w:r>
               <w:rPr>
-                <w:rFonts w:ascii="Century Gothic" w:hAnsi="Century Gothic"/>
+                <w:rFonts w:asciiTheme="minorHAnsi" w:hAnsiTheme="minorHAnsi" w:cstheme="minorHAnsi"/>
                 <w:b/>
                 <w:bCs/>
                 <w:color w:val="auto"/>
@@ -847,20 +719,31 @@
             <w:pPr>
               <w:pStyle w:val="p1"/>
               <w:rPr>
-                <w:rFonts w:ascii="Century Gothic" w:hAnsi="Century Gothic"/>
-                <w:color w:val="auto"/>
-                <w:sz w:val="20"/>
-                <w:szCs w:val="18"/>
-              </w:rPr>
-            </w:pPr>
-            <w:r>
-              <w:rPr>
-                <w:rFonts w:ascii="Century Gothic" w:hAnsi="Century Gothic"/>
-                <w:color w:val="auto"/>
-                <w:sz w:val="20"/>
-                <w:szCs w:val="18"/>
-              </w:rPr>
-              <w:t>Jul, 22, 2025, 01:07 PM.</w:t>
+                <w:rFonts w:asciiTheme="minorHAnsi" w:hAnsiTheme="minorHAnsi" w:cstheme="minorHAnsi"/>
+                <w:color w:val="auto"/>
+                <w:sz w:val="20"/>
+                <w:szCs w:val="18"/>
+              </w:rPr>
+            </w:pPr>
+            <w:proofErr w:type="gramStart"/>
+            <w:r>
+              <w:rPr>
+                <w:rFonts w:asciiTheme="minorHAnsi" w:hAnsiTheme="minorHAnsi" w:cstheme="minorHAnsi"/>
+                <w:color w:val="auto"/>
+                <w:sz w:val="20"/>
+                <w:szCs w:val="18"/>
+              </w:rPr>
+              <w:t>Jul,</w:t>
+            </w:r>
+            <w:proofErr w:type="gramEnd"/>
+            <w:r>
+              <w:rPr>
+                <w:rFonts w:asciiTheme="minorHAnsi" w:hAnsiTheme="minorHAnsi" w:cstheme="minorHAnsi"/>
+                <w:color w:val="auto"/>
+                <w:sz w:val="20"/>
+                <w:szCs w:val="18"/>
+              </w:rPr>
+              <w:t xml:space="preserve"> 22, 2025, 01:07 PM.</w:t>
             </w:r>
           </w:p>
         </w:tc>
@@ -883,16 +766,16 @@
             <w:pPr>
               <w:pStyle w:val="p1"/>
               <w:rPr>
-                <w:rFonts w:ascii="Century Gothic" w:hAnsi="Century Gothic"/>
-                <w:b/>
-                <w:bCs/>
-                <w:color w:val="auto"/>
-                <w:sz w:val="20"/>
-              </w:rPr>
-            </w:pPr>
-            <w:r>
-              <w:rPr>
-                <w:rFonts w:ascii="Century Gothic" w:hAnsi="Century Gothic"/>
+                <w:rFonts w:asciiTheme="minorHAnsi" w:hAnsiTheme="minorHAnsi" w:cstheme="minorHAnsi"/>
+                <w:b/>
+                <w:bCs/>
+                <w:color w:val="auto"/>
+                <w:sz w:val="20"/>
+              </w:rPr>
+            </w:pPr>
+            <w:r>
+              <w:rPr>
+                <w:rFonts w:asciiTheme="minorHAnsi" w:hAnsiTheme="minorHAnsi" w:cstheme="minorHAnsi"/>
                 <w:b/>
                 <w:bCs/>
                 <w:color w:val="auto"/>
@@ -903,7 +786,7 @@
             </w:r>
             <w:r>
               <w:rPr>
-                <w:rFonts w:ascii="Century Gothic" w:hAnsi="Century Gothic"/>
+                <w:rFonts w:asciiTheme="minorHAnsi" w:hAnsiTheme="minorHAnsi" w:cstheme="minorHAnsi"/>
                 <w:b/>
                 <w:bCs/>
                 <w:color w:val="auto"/>
@@ -914,7 +797,7 @@
             </w:r>
             <w:r>
               <w:rPr>
-                <w:rFonts w:ascii="Century Gothic" w:hAnsi="Century Gothic"/>
+                <w:rFonts w:asciiTheme="minorHAnsi" w:hAnsiTheme="minorHAnsi" w:cstheme="minorHAnsi"/>
                 <w:b/>
                 <w:bCs/>
                 <w:color w:val="auto"/>
@@ -947,20 +830,40 @@
             <w:pPr>
               <w:pStyle w:val="p1"/>
               <w:rPr>
-                <w:rFonts w:ascii="Century Gothic" w:hAnsi="Century Gothic"/>
-                <w:color w:val="auto"/>
-                <w:sz w:val="20"/>
-                <w:szCs w:val="18"/>
-              </w:rPr>
-            </w:pPr>
-            <w:r>
-              <w:rPr>
-                <w:rFonts w:ascii="Century Gothic" w:hAnsi="Century Gothic"/>
-                <w:color w:val="auto"/>
-                <w:sz w:val="20"/>
-                <w:szCs w:val="18"/>
-              </w:rPr>
-              <w:t>A Critical severity alert was triggered in the Monitoring system under the rule "SOC342 - CVE-2025-53770 SharePoint ToolShell Auth Bypass and RCE".</w:t>
+                <w:rFonts w:asciiTheme="minorHAnsi" w:hAnsiTheme="minorHAnsi" w:cstheme="minorHAnsi"/>
+                <w:color w:val="auto"/>
+                <w:sz w:val="20"/>
+                <w:szCs w:val="18"/>
+              </w:rPr>
+            </w:pPr>
+            <w:r>
+              <w:rPr>
+                <w:rFonts w:asciiTheme="minorHAnsi" w:hAnsiTheme="minorHAnsi" w:cstheme="minorHAnsi"/>
+                <w:color w:val="auto"/>
+                <w:sz w:val="20"/>
+                <w:szCs w:val="18"/>
+              </w:rPr>
+              <w:t xml:space="preserve">A Critical severity alert was triggered in the Monitoring system under the rule "SOC342 - CVE-2025-53770 SharePoint </w:t>
+            </w:r>
+            <w:proofErr w:type="spellStart"/>
+            <w:r>
+              <w:rPr>
+                <w:rFonts w:asciiTheme="minorHAnsi" w:hAnsiTheme="minorHAnsi" w:cstheme="minorHAnsi"/>
+                <w:color w:val="auto"/>
+                <w:sz w:val="20"/>
+                <w:szCs w:val="18"/>
+              </w:rPr>
+              <w:t>ToolShell</w:t>
+            </w:r>
+            <w:proofErr w:type="spellEnd"/>
+            <w:r>
+              <w:rPr>
+                <w:rFonts w:asciiTheme="minorHAnsi" w:hAnsiTheme="minorHAnsi" w:cstheme="minorHAnsi"/>
+                <w:color w:val="auto"/>
+                <w:sz w:val="20"/>
+                <w:szCs w:val="18"/>
+              </w:rPr>
+              <w:t xml:space="preserve"> Auth Bypass and RCE".</w:t>
             </w:r>
           </w:p>
         </w:tc>
@@ -983,16 +886,16 @@
             <w:pPr>
               <w:pStyle w:val="p1"/>
               <w:rPr>
-                <w:rFonts w:ascii="Century Gothic" w:hAnsi="Century Gothic"/>
-                <w:b/>
-                <w:bCs/>
-                <w:color w:val="auto"/>
-                <w:sz w:val="20"/>
-              </w:rPr>
-            </w:pPr>
-            <w:r>
-              <w:rPr>
-                <w:rFonts w:ascii="Century Gothic" w:hAnsi="Century Gothic"/>
+                <w:rFonts w:asciiTheme="minorHAnsi" w:hAnsiTheme="minorHAnsi" w:cstheme="minorHAnsi"/>
+                <w:b/>
+                <w:bCs/>
+                <w:color w:val="auto"/>
+                <w:sz w:val="20"/>
+              </w:rPr>
+            </w:pPr>
+            <w:r>
+              <w:rPr>
+                <w:rFonts w:asciiTheme="minorHAnsi" w:hAnsiTheme="minorHAnsi" w:cstheme="minorHAnsi"/>
                 <w:b/>
                 <w:bCs/>
                 <w:color w:val="auto"/>
@@ -1003,7 +906,7 @@
             </w:r>
             <w:r>
               <w:rPr>
-                <w:rFonts w:ascii="Century Gothic" w:hAnsi="Century Gothic"/>
+                <w:rFonts w:asciiTheme="minorHAnsi" w:hAnsiTheme="minorHAnsi" w:cstheme="minorHAnsi"/>
                 <w:b/>
                 <w:bCs/>
                 <w:color w:val="auto"/>
@@ -1035,152 +938,284 @@
           <w:p>
             <w:pPr>
               <w:pStyle w:val="p1"/>
-              <w:rPr>
-                <w:rFonts w:ascii="Century Gothic" w:hAnsi="Century Gothic"/>
-                <w:sz w:val="20"/>
-                <w:szCs w:val="18"/>
-              </w:rPr>
-            </w:pPr>
-            <w:r>
-              <w:rPr>
-                <w:rFonts w:ascii="Century Gothic" w:hAnsi="Century Gothic"/>
-                <w:sz w:val="20"/>
-                <w:szCs w:val="18"/>
-              </w:rPr>
-              <w:t>  An external source IP (107.191.58.76) targeted the internal destination IP 172.16.20.17 (Hostname: SharePoint01) with a suspicious unauthenticated HTTP POST request.</w:t>
-            </w:r>
-          </w:p>
-          <w:p>
-            <w:pPr>
-              <w:pStyle w:val="p1"/>
-              <w:rPr>
-                <w:rFonts w:ascii="Century Gothic" w:hAnsi="Century Gothic"/>
-                <w:sz w:val="20"/>
-                <w:szCs w:val="18"/>
-              </w:rPr>
-            </w:pPr>
-            <w:r>
-              <w:rPr>
-                <w:rFonts w:ascii="Century Gothic" w:hAnsi="Century Gothic"/>
-                <w:sz w:val="20"/>
-                <w:szCs w:val="18"/>
-              </w:rPr>
-              <w:t>  The request targeted the URL /_layouts/15/ToolPane.aspx?DisplayMode=Edit&amp;a=... and the security controls logged the Device Action as "Allowed".</w:t>
-            </w:r>
-          </w:p>
-          <w:p>
-            <w:pPr>
-              <w:pStyle w:val="p1"/>
-              <w:rPr>
-                <w:rFonts w:ascii="Century Gothic" w:hAnsi="Century Gothic"/>
-                <w:sz w:val="20"/>
-                <w:szCs w:val="18"/>
-              </w:rPr>
-            </w:pPr>
-            <w:r>
-              <w:rPr>
-                <w:rFonts w:ascii="Century Gothic" w:hAnsi="Century Gothic"/>
-                <w:sz w:val="20"/>
-                <w:szCs w:val="18"/>
-              </w:rPr>
-              <w:t>  The Threat Intelligence feed associates the source IP (107.191.58.76) directly with the "CVE-2025-53770" tag.</w:t>
-            </w:r>
-          </w:p>
-          <w:p>
-            <w:pPr>
-              <w:pStyle w:val="p1"/>
-              <w:rPr>
-                <w:rFonts w:ascii="Century Gothic" w:hAnsi="Century Gothic"/>
-                <w:sz w:val="20"/>
-                <w:szCs w:val="18"/>
-              </w:rPr>
-            </w:pPr>
-            <w:r>
-              <w:rPr>
-                <w:rFonts w:ascii="Century Gothic" w:hAnsi="Century Gothic"/>
-                <w:sz w:val="20"/>
-                <w:szCs w:val="18"/>
-              </w:rPr>
-              <w:t>  Endpoint security logs for SharePoint01 reveal that the attacker achieved Remote Code Execution (RCE) by executing heavily obfuscated PowerShell commands (powershell.exe -nop -w hidden -e ...).</w:t>
-            </w:r>
-          </w:p>
-          <w:p>
-            <w:pPr>
-              <w:pStyle w:val="p1"/>
-              <w:rPr>
-                <w:rFonts w:ascii="Century Gothic" w:hAnsi="Century Gothic"/>
-                <w:sz w:val="20"/>
-                <w:szCs w:val="18"/>
-              </w:rPr>
-            </w:pPr>
-            <w:r>
-              <w:rPr>
-                <w:rFonts w:ascii="Century Gothic" w:hAnsi="Century Gothic"/>
-                <w:sz w:val="20"/>
-                <w:szCs w:val="18"/>
-              </w:rPr>
-              <w:t>  Running under the IIS APPPOOL\SharePoint - 80 process user context, the attacker spawned cmd.exe to write a malicious ASPX file.</w:t>
-            </w:r>
-          </w:p>
-          <w:p>
-            <w:pPr>
-              <w:pStyle w:val="p1"/>
-              <w:rPr>
-                <w:rFonts w:ascii="Century Gothic" w:hAnsi="Century Gothic"/>
-                <w:sz w:val="20"/>
-                <w:szCs w:val="18"/>
-              </w:rPr>
-            </w:pPr>
-            <w:r>
-              <w:rPr>
-                <w:rFonts w:ascii="Century Gothic" w:hAnsi="Century Gothic"/>
-                <w:sz w:val="20"/>
-                <w:szCs w:val="18"/>
-              </w:rPr>
-              <w:t>  The file, named spinstall0.aspx, was dropped into the directory C:\Program Files\Common Files\Microsoft Shared\Web Server Extensions\16\TEMPLATE\LAYOUTS\ and contained code designed to fetch a secondary payload (payload.exe) from the attacker's server.</w:t>
-            </w:r>
-          </w:p>
-          <w:p>
-            <w:pPr>
-              <w:pStyle w:val="p1"/>
-              <w:rPr>
-                <w:rFonts w:ascii="Century Gothic" w:hAnsi="Century Gothic"/>
-                <w:sz w:val="20"/>
-                <w:szCs w:val="18"/>
-              </w:rPr>
-            </w:pPr>
-            <w:r>
-              <w:rPr>
-                <w:rFonts w:ascii="Century Gothic" w:hAnsi="Century Gothic"/>
-                <w:sz w:val="20"/>
-                <w:szCs w:val="18"/>
-              </w:rPr>
-              <w:t>  VirusTotal analysis of the dropped file's hash (92bb4ddb98eeaf11fc15bb32e71d0a63256a0ed826a03ba293ce3a8bf057a514) confirms it is a Trojan webshell (ToolShell), flagged by 41 out of 60 security vendors.</w:t>
-            </w:r>
-          </w:p>
-          <w:p>
-            <w:pPr>
-              <w:pStyle w:val="p1"/>
-              <w:rPr>
-                <w:rFonts w:ascii="Century Gothic" w:hAnsi="Century Gothic"/>
-                <w:sz w:val="20"/>
-                <w:szCs w:val="18"/>
-              </w:rPr>
-            </w:pPr>
-            <w:r>
-              <w:rPr>
-                <w:rFonts w:ascii="Century Gothic" w:hAnsi="Century Gothic"/>
-                <w:sz w:val="20"/>
-                <w:szCs w:val="18"/>
-              </w:rPr>
-              <w:t>  A successful outbound network connection was subsequently established from the compromised SharePoint01 server back to the attacker's IP (107.191.58.76) on Jul 22, 2025, at 13:08:04.</w:t>
-            </w:r>
-          </w:p>
-          <w:p>
-            <w:pPr>
-              <w:pStyle w:val="p1"/>
-              <w:rPr>
-                <w:rFonts w:ascii="Century Gothic" w:hAnsi="Century Gothic"/>
+              <w:numPr>
+                <w:ilvl w:val="0"/>
+                <w:numId w:val="9"/>
+              </w:numPr>
+              <w:rPr>
+                <w:rFonts w:asciiTheme="minorHAnsi" w:hAnsiTheme="minorHAnsi" w:cstheme="minorHAnsi"/>
+                <w:sz w:val="20"/>
+                <w:szCs w:val="18"/>
+              </w:rPr>
+            </w:pPr>
+            <w:r>
+              <w:rPr>
+                <w:rFonts w:asciiTheme="minorHAnsi" w:hAnsiTheme="minorHAnsi" w:cstheme="minorHAnsi"/>
+                <w:sz w:val="20"/>
+                <w:szCs w:val="18"/>
+              </w:rPr>
+              <w:t>An external source IP (107.191.58.76) targeted the internal destination IP 172.16.20.17 (Hostname: SharePoint01) with a suspicious unauthenticated HTTP POST request.</w:t>
+            </w:r>
+          </w:p>
+          <w:p>
+            <w:pPr>
+              <w:pStyle w:val="p1"/>
+              <w:numPr>
+                <w:ilvl w:val="0"/>
+                <w:numId w:val="9"/>
+              </w:numPr>
+              <w:rPr>
+                <w:rFonts w:asciiTheme="minorHAnsi" w:hAnsiTheme="minorHAnsi" w:cstheme="minorHAnsi"/>
+                <w:sz w:val="20"/>
+                <w:szCs w:val="18"/>
+              </w:rPr>
+            </w:pPr>
+            <w:r>
+              <w:rPr>
+                <w:rFonts w:asciiTheme="minorHAnsi" w:hAnsiTheme="minorHAnsi" w:cstheme="minorHAnsi"/>
+                <w:sz w:val="20"/>
+                <w:szCs w:val="18"/>
+              </w:rPr>
+              <w:t>The request targeted the URL /_layouts/15/</w:t>
+            </w:r>
+            <w:proofErr w:type="spellStart"/>
+            <w:r>
+              <w:rPr>
+                <w:rFonts w:asciiTheme="minorHAnsi" w:hAnsiTheme="minorHAnsi" w:cstheme="minorHAnsi"/>
+                <w:sz w:val="20"/>
+                <w:szCs w:val="18"/>
+              </w:rPr>
+              <w:t>ToolPane.aspx?DisplayMode</w:t>
+            </w:r>
+            <w:proofErr w:type="spellEnd"/>
+            <w:r>
+              <w:rPr>
+                <w:rFonts w:asciiTheme="minorHAnsi" w:hAnsiTheme="minorHAnsi" w:cstheme="minorHAnsi"/>
+                <w:sz w:val="20"/>
+                <w:szCs w:val="18"/>
+              </w:rPr>
+              <w:t>=</w:t>
+            </w:r>
+            <w:proofErr w:type="spellStart"/>
+            <w:r>
+              <w:rPr>
+                <w:rFonts w:asciiTheme="minorHAnsi" w:hAnsiTheme="minorHAnsi" w:cstheme="minorHAnsi"/>
+                <w:sz w:val="20"/>
+                <w:szCs w:val="18"/>
+              </w:rPr>
+              <w:t>Edit&amp;a</w:t>
+            </w:r>
+            <w:proofErr w:type="spellEnd"/>
+            <w:r>
+              <w:rPr>
+                <w:rFonts w:asciiTheme="minorHAnsi" w:hAnsiTheme="minorHAnsi" w:cstheme="minorHAnsi"/>
+                <w:sz w:val="20"/>
+                <w:szCs w:val="18"/>
+              </w:rPr>
+              <w:t>=... and the security controls logged the Device Action as "Allowed".</w:t>
+            </w:r>
+          </w:p>
+          <w:p>
+            <w:pPr>
+              <w:pStyle w:val="p1"/>
+              <w:numPr>
+                <w:ilvl w:val="0"/>
+                <w:numId w:val="9"/>
+              </w:numPr>
+              <w:rPr>
+                <w:rFonts w:asciiTheme="minorHAnsi" w:hAnsiTheme="minorHAnsi" w:cstheme="minorHAnsi"/>
+                <w:sz w:val="20"/>
+                <w:szCs w:val="18"/>
+              </w:rPr>
+            </w:pPr>
+            <w:r>
+              <w:rPr>
+                <w:rFonts w:asciiTheme="minorHAnsi" w:hAnsiTheme="minorHAnsi" w:cstheme="minorHAnsi"/>
+                <w:sz w:val="20"/>
+                <w:szCs w:val="18"/>
+              </w:rPr>
+              <w:t>The Threat Intelligence feed associates the source IP (107.191.58.76) directly with the "CVE-2025-53770" tag.</w:t>
+            </w:r>
+          </w:p>
+          <w:p>
+            <w:pPr>
+              <w:pStyle w:val="p1"/>
+              <w:numPr>
+                <w:ilvl w:val="0"/>
+                <w:numId w:val="9"/>
+              </w:numPr>
+              <w:rPr>
+                <w:rFonts w:asciiTheme="minorHAnsi" w:hAnsiTheme="minorHAnsi" w:cstheme="minorHAnsi"/>
+                <w:sz w:val="20"/>
+                <w:szCs w:val="18"/>
+              </w:rPr>
+            </w:pPr>
+            <w:r>
+              <w:rPr>
+                <w:rFonts w:asciiTheme="minorHAnsi" w:hAnsiTheme="minorHAnsi" w:cstheme="minorHAnsi"/>
+                <w:sz w:val="20"/>
+                <w:szCs w:val="18"/>
+              </w:rPr>
+              <w:t>Endpoint security logs for SharePoint01 reveal that the attacker achieved Remote Code Execution (RCE) by executing heavily obfuscated PowerShell commands (powershell.exe -</w:t>
+            </w:r>
+            <w:proofErr w:type="spellStart"/>
+            <w:r>
+              <w:rPr>
+                <w:rFonts w:asciiTheme="minorHAnsi" w:hAnsiTheme="minorHAnsi" w:cstheme="minorHAnsi"/>
+                <w:sz w:val="20"/>
+                <w:szCs w:val="18"/>
+              </w:rPr>
+              <w:t>nop</w:t>
+            </w:r>
+            <w:proofErr w:type="spellEnd"/>
+            <w:r>
+              <w:rPr>
+                <w:rFonts w:asciiTheme="minorHAnsi" w:hAnsiTheme="minorHAnsi" w:cstheme="minorHAnsi"/>
+                <w:sz w:val="20"/>
+                <w:szCs w:val="18"/>
+              </w:rPr>
+              <w:t xml:space="preserve"> -w hidden -e ...).</w:t>
+            </w:r>
+          </w:p>
+          <w:p>
+            <w:pPr>
+              <w:pStyle w:val="p1"/>
+              <w:numPr>
+                <w:ilvl w:val="0"/>
+                <w:numId w:val="9"/>
+              </w:numPr>
+              <w:rPr>
+                <w:rFonts w:asciiTheme="minorHAnsi" w:hAnsiTheme="minorHAnsi" w:cstheme="minorHAnsi"/>
+                <w:sz w:val="20"/>
+                <w:szCs w:val="18"/>
+              </w:rPr>
+            </w:pPr>
+            <w:r>
+              <w:rPr>
+                <w:rFonts w:asciiTheme="minorHAnsi" w:hAnsiTheme="minorHAnsi" w:cstheme="minorHAnsi"/>
+                <w:sz w:val="20"/>
+                <w:szCs w:val="18"/>
+              </w:rPr>
+              <w:t>Running under the IIS APPPOOL\SharePoint - 80 process user context, the attacker spawned cmd.exe to write a malicious ASPX file.</w:t>
+            </w:r>
+          </w:p>
+          <w:p>
+            <w:pPr>
+              <w:pStyle w:val="p1"/>
+              <w:numPr>
+                <w:ilvl w:val="0"/>
+                <w:numId w:val="9"/>
+              </w:numPr>
+              <w:rPr>
+                <w:rFonts w:asciiTheme="minorHAnsi" w:hAnsiTheme="minorHAnsi" w:cstheme="minorHAnsi"/>
+                <w:sz w:val="20"/>
+                <w:szCs w:val="18"/>
+              </w:rPr>
+            </w:pPr>
+            <w:r>
+              <w:rPr>
+                <w:rFonts w:asciiTheme="minorHAnsi" w:hAnsiTheme="minorHAnsi" w:cstheme="minorHAnsi"/>
+                <w:sz w:val="20"/>
+                <w:szCs w:val="18"/>
+              </w:rPr>
+              <w:t>The file, named spinstall0.aspx, was dropped into the directory C:\Program Files\Common Files\Microsoft Shared\Web Server Extensions\16\TEMPLATE\LAYOUTS\ and contained code designed to fetch a secondary payload (payload.exe) from the attacker's server.</w:t>
+            </w:r>
+          </w:p>
+          <w:p>
+            <w:pPr>
+              <w:pStyle w:val="p1"/>
+              <w:numPr>
+                <w:ilvl w:val="0"/>
+                <w:numId w:val="9"/>
+              </w:numPr>
+              <w:rPr>
+                <w:rFonts w:asciiTheme="minorHAnsi" w:hAnsiTheme="minorHAnsi" w:cstheme="minorHAnsi"/>
+                <w:sz w:val="20"/>
+                <w:szCs w:val="18"/>
+              </w:rPr>
+            </w:pPr>
+            <w:proofErr w:type="spellStart"/>
+            <w:r>
+              <w:rPr>
+                <w:rFonts w:asciiTheme="minorHAnsi" w:hAnsiTheme="minorHAnsi" w:cstheme="minorHAnsi"/>
+                <w:sz w:val="20"/>
+                <w:szCs w:val="18"/>
+              </w:rPr>
+              <w:t>VirusTotal</w:t>
+            </w:r>
+            <w:proofErr w:type="spellEnd"/>
+            <w:r>
+              <w:rPr>
+                <w:rFonts w:asciiTheme="minorHAnsi" w:hAnsiTheme="minorHAnsi" w:cstheme="minorHAnsi"/>
+                <w:sz w:val="20"/>
+                <w:szCs w:val="18"/>
+              </w:rPr>
+              <w:t xml:space="preserve"> analysis of the dropped file's hash (92bb4ddb98eeaf11fc15bb32e71d0a63256a0ed826a03ba293ce3a8bf057a514) confirms it is a Trojan </w:t>
+            </w:r>
+            <w:proofErr w:type="spellStart"/>
+            <w:r>
+              <w:rPr>
+                <w:rFonts w:asciiTheme="minorHAnsi" w:hAnsiTheme="minorHAnsi" w:cstheme="minorHAnsi"/>
+                <w:sz w:val="20"/>
+                <w:szCs w:val="18"/>
+              </w:rPr>
+              <w:t>webshell</w:t>
+            </w:r>
+            <w:proofErr w:type="spellEnd"/>
+            <w:r>
+              <w:rPr>
+                <w:rFonts w:asciiTheme="minorHAnsi" w:hAnsiTheme="minorHAnsi" w:cstheme="minorHAnsi"/>
+                <w:sz w:val="20"/>
+                <w:szCs w:val="18"/>
+              </w:rPr>
+              <w:t xml:space="preserve"> (</w:t>
+            </w:r>
+            <w:proofErr w:type="spellStart"/>
+            <w:r>
+              <w:rPr>
+                <w:rFonts w:asciiTheme="minorHAnsi" w:hAnsiTheme="minorHAnsi" w:cstheme="minorHAnsi"/>
+                <w:sz w:val="20"/>
+                <w:szCs w:val="18"/>
+              </w:rPr>
+              <w:t>ToolShell</w:t>
+            </w:r>
+            <w:proofErr w:type="spellEnd"/>
+            <w:r>
+              <w:rPr>
+                <w:rFonts w:asciiTheme="minorHAnsi" w:hAnsiTheme="minorHAnsi" w:cstheme="minorHAnsi"/>
+                <w:sz w:val="20"/>
+                <w:szCs w:val="18"/>
+              </w:rPr>
+              <w:t>), flagged by 41 out of 60 security vendors.</w:t>
+            </w:r>
+          </w:p>
+          <w:p>
+            <w:pPr>
+              <w:pStyle w:val="p1"/>
+              <w:numPr>
+                <w:ilvl w:val="0"/>
+                <w:numId w:val="9"/>
+              </w:numPr>
+              <w:rPr>
+                <w:rFonts w:asciiTheme="minorHAnsi" w:hAnsiTheme="minorHAnsi" w:cstheme="minorHAnsi"/>
+                <w:sz w:val="20"/>
+                <w:szCs w:val="18"/>
+              </w:rPr>
+            </w:pPr>
+            <w:r>
+              <w:rPr>
+                <w:rFonts w:asciiTheme="minorHAnsi" w:hAnsiTheme="minorHAnsi" w:cstheme="minorHAnsi"/>
+                <w:sz w:val="20"/>
+                <w:szCs w:val="18"/>
+              </w:rPr>
+              <w:t>A successful outbound network connection was subsequently established from the compromised SharePoint01 server back to the attacker's IP (107.191.58.76) on Jul 22, 2025, at 13:08:04.</w:t>
+            </w:r>
+          </w:p>
+          <w:p>
+            <w:pPr>
+              <w:pStyle w:val="p1"/>
+              <w:rPr>
+                <w:rFonts w:asciiTheme="minorHAnsi" w:hAnsiTheme="minorHAnsi" w:cstheme="minorHAnsi"/>
                 <w:color w:val="auto"/>
                 <w:sz w:val="20"/>
                 <w:szCs w:val="18"/>
@@ -1206,16 +1241,16 @@
             <w:pPr>
               <w:pStyle w:val="p1"/>
               <w:rPr>
-                <w:rFonts w:ascii="Century Gothic" w:hAnsi="Century Gothic"/>
-                <w:b/>
-                <w:bCs/>
-                <w:color w:val="auto"/>
-                <w:sz w:val="20"/>
-              </w:rPr>
-            </w:pPr>
-            <w:r>
-              <w:rPr>
-                <w:rFonts w:ascii="Century Gothic" w:hAnsi="Century Gothic"/>
+                <w:rFonts w:asciiTheme="minorHAnsi" w:hAnsiTheme="minorHAnsi" w:cstheme="minorHAnsi"/>
+                <w:b/>
+                <w:bCs/>
+                <w:color w:val="auto"/>
+                <w:sz w:val="20"/>
+              </w:rPr>
+            </w:pPr>
+            <w:r>
+              <w:rPr>
+                <w:rFonts w:asciiTheme="minorHAnsi" w:hAnsiTheme="minorHAnsi" w:cstheme="minorHAnsi"/>
                 <w:b/>
                 <w:bCs/>
                 <w:color w:val="auto"/>
@@ -1238,7 +1273,7 @@
             <w:pPr>
               <w:pStyle w:val="p1"/>
               <w:rPr>
-                <w:rFonts w:ascii="Century Gothic" w:hAnsi="Century Gothic"/>
+                <w:rFonts w:asciiTheme="minorHAnsi" w:hAnsiTheme="minorHAnsi" w:cstheme="minorHAnsi"/>
                 <w:b/>
                 <w:bCs/>
                 <w:color w:val="auto"/>
@@ -1262,7 +1297,7 @@
               <w:pStyle w:val="p1"/>
               <w:jc w:val="center"/>
               <w:rPr>
-                <w:rFonts w:ascii="Century Gothic" w:hAnsi="Century Gothic"/>
+                <w:rFonts w:asciiTheme="minorHAnsi" w:hAnsiTheme="minorHAnsi" w:cstheme="minorHAnsi"/>
                 <w:color w:val="auto"/>
                 <w:sz w:val="20"/>
                 <w:szCs w:val="18"/>
@@ -1271,7 +1306,7 @@
             <w:sdt>
               <w:sdtPr>
                 <w:rPr>
-                  <w:rFonts w:ascii="Century Gothic" w:hAnsi="Century Gothic"/>
+                  <w:rFonts w:asciiTheme="minorHAnsi" w:hAnsiTheme="minorHAnsi" w:cstheme="minorHAnsi"/>
                   <w:color w:val="auto"/>
                   <w:sz w:val="20"/>
                   <w:szCs w:val="18"/>
@@ -1286,7 +1321,7 @@
               <w:sdtContent>
                 <w:r>
                   <w:rPr>
-                    <w:rFonts w:ascii="MS Gothic" w:eastAsia="MS Gothic" w:hAnsi="MS Gothic" w:hint="eastAsia"/>
+                    <w:rFonts w:ascii="Segoe UI Symbol" w:eastAsia="MS Gothic" w:hAnsi="Segoe UI Symbol" w:cs="Segoe UI Symbol"/>
                     <w:color w:val="auto"/>
                     <w:sz w:val="20"/>
                     <w:szCs w:val="18"/>
@@ -1297,7 +1332,7 @@
             </w:sdt>
             <w:r>
               <w:rPr>
-                <w:rFonts w:ascii="Century Gothic" w:hAnsi="Century Gothic"/>
+                <w:rFonts w:asciiTheme="minorHAnsi" w:hAnsiTheme="minorHAnsi" w:cstheme="minorHAnsi"/>
                 <w:color w:val="auto"/>
                 <w:sz w:val="20"/>
                 <w:szCs w:val="18"/>
@@ -1316,7 +1351,7 @@
               <w:pStyle w:val="p1"/>
               <w:jc w:val="center"/>
               <w:rPr>
-                <w:rFonts w:ascii="Century Gothic" w:hAnsi="Century Gothic"/>
+                <w:rFonts w:asciiTheme="minorHAnsi" w:hAnsiTheme="minorHAnsi" w:cstheme="minorHAnsi"/>
                 <w:color w:val="auto"/>
                 <w:sz w:val="20"/>
                 <w:szCs w:val="18"/>
@@ -1325,7 +1360,7 @@
             <w:sdt>
               <w:sdtPr>
                 <w:rPr>
-                  <w:rFonts w:ascii="Century Gothic" w:hAnsi="Century Gothic"/>
+                  <w:rFonts w:asciiTheme="minorHAnsi" w:hAnsiTheme="minorHAnsi" w:cstheme="minorHAnsi"/>
                   <w:color w:val="auto"/>
                   <w:sz w:val="20"/>
                   <w:szCs w:val="18"/>
@@ -1340,7 +1375,7 @@
               <w:sdtContent>
                 <w:r>
                   <w:rPr>
-                    <w:rFonts w:ascii="MS Gothic" w:eastAsia="MS Gothic" w:hAnsi="MS Gothic" w:hint="eastAsia"/>
+                    <w:rFonts w:ascii="Segoe UI Symbol" w:eastAsia="MS Gothic" w:hAnsi="Segoe UI Symbol" w:cs="Segoe UI Symbol"/>
                     <w:color w:val="auto"/>
                     <w:sz w:val="20"/>
                     <w:szCs w:val="18"/>
@@ -1351,7 +1386,7 @@
             </w:sdt>
             <w:r>
               <w:rPr>
-                <w:rFonts w:ascii="Century Gothic" w:hAnsi="Century Gothic"/>
+                <w:rFonts w:asciiTheme="minorHAnsi" w:hAnsiTheme="minorHAnsi" w:cstheme="minorHAnsi"/>
                 <w:color w:val="auto"/>
                 <w:sz w:val="20"/>
                 <w:szCs w:val="18"/>
@@ -1371,7 +1406,7 @@
               <w:pStyle w:val="p1"/>
               <w:jc w:val="center"/>
               <w:rPr>
-                <w:rFonts w:ascii="Century Gothic" w:hAnsi="Century Gothic"/>
+                <w:rFonts w:asciiTheme="minorHAnsi" w:hAnsiTheme="minorHAnsi" w:cstheme="minorHAnsi"/>
                 <w:color w:val="auto"/>
                 <w:sz w:val="20"/>
                 <w:szCs w:val="18"/>
@@ -1394,16 +1429,16 @@
             <w:pPr>
               <w:pStyle w:val="p1"/>
               <w:rPr>
-                <w:rFonts w:ascii="Century Gothic" w:hAnsi="Century Gothic"/>
-                <w:b/>
-                <w:bCs/>
-                <w:color w:val="auto"/>
-                <w:sz w:val="20"/>
-              </w:rPr>
-            </w:pPr>
-            <w:r>
-              <w:rPr>
-                <w:rFonts w:ascii="Century Gothic" w:hAnsi="Century Gothic"/>
+                <w:rFonts w:asciiTheme="minorHAnsi" w:hAnsiTheme="minorHAnsi" w:cstheme="minorHAnsi"/>
+                <w:b/>
+                <w:bCs/>
+                <w:color w:val="auto"/>
+                <w:sz w:val="20"/>
+              </w:rPr>
+            </w:pPr>
+            <w:r>
+              <w:rPr>
+                <w:rFonts w:asciiTheme="minorHAnsi" w:hAnsiTheme="minorHAnsi" w:cstheme="minorHAnsi"/>
                 <w:b/>
                 <w:bCs/>
                 <w:color w:val="auto"/>
@@ -1422,7 +1457,7 @@
             <w:pPr>
               <w:pStyle w:val="p1"/>
               <w:rPr>
-                <w:rFonts w:ascii="Century Gothic" w:hAnsi="Century Gothic"/>
+                <w:rFonts w:asciiTheme="minorHAnsi" w:hAnsiTheme="minorHAnsi" w:cstheme="minorHAnsi"/>
                 <w:b/>
                 <w:bCs/>
                 <w:color w:val="auto"/>
@@ -1446,7 +1481,7 @@
               <w:pStyle w:val="p1"/>
               <w:jc w:val="center"/>
               <w:rPr>
-                <w:rFonts w:ascii="Century Gothic" w:hAnsi="Century Gothic"/>
+                <w:rFonts w:asciiTheme="minorHAnsi" w:hAnsiTheme="minorHAnsi" w:cstheme="minorHAnsi"/>
                 <w:color w:val="auto"/>
                 <w:sz w:val="20"/>
                 <w:szCs w:val="18"/>
@@ -1455,7 +1490,7 @@
             <w:sdt>
               <w:sdtPr>
                 <w:rPr>
-                  <w:rFonts w:ascii="Century Gothic" w:hAnsi="Century Gothic"/>
+                  <w:rFonts w:asciiTheme="minorHAnsi" w:hAnsiTheme="minorHAnsi" w:cstheme="minorHAnsi"/>
                   <w:color w:val="auto"/>
                   <w:sz w:val="20"/>
                   <w:szCs w:val="18"/>
@@ -1470,7 +1505,7 @@
               <w:sdtContent>
                 <w:r>
                   <w:rPr>
-                    <w:rFonts w:ascii="MS Gothic" w:eastAsia="MS Gothic" w:hAnsi="MS Gothic" w:hint="eastAsia"/>
+                    <w:rFonts w:ascii="Segoe UI Symbol" w:eastAsia="MS Gothic" w:hAnsi="Segoe UI Symbol" w:cs="Segoe UI Symbol"/>
                     <w:color w:val="auto"/>
                     <w:sz w:val="20"/>
                     <w:szCs w:val="18"/>
@@ -1481,7 +1516,7 @@
             </w:sdt>
             <w:r>
               <w:rPr>
-                <w:rFonts w:ascii="Century Gothic" w:hAnsi="Century Gothic"/>
+                <w:rFonts w:asciiTheme="minorHAnsi" w:hAnsiTheme="minorHAnsi" w:cstheme="minorHAnsi"/>
                 <w:color w:val="auto"/>
                 <w:sz w:val="20"/>
                 <w:szCs w:val="18"/>
@@ -1500,7 +1535,7 @@
               <w:pStyle w:val="p1"/>
               <w:jc w:val="center"/>
               <w:rPr>
-                <w:rFonts w:ascii="Century Gothic" w:hAnsi="Century Gothic"/>
+                <w:rFonts w:asciiTheme="minorHAnsi" w:hAnsiTheme="minorHAnsi" w:cstheme="minorHAnsi"/>
                 <w:color w:val="auto"/>
                 <w:sz w:val="20"/>
                 <w:szCs w:val="18"/>
@@ -1509,7 +1544,7 @@
             <w:sdt>
               <w:sdtPr>
                 <w:rPr>
-                  <w:rFonts w:ascii="Century Gothic" w:hAnsi="Century Gothic"/>
+                  <w:rFonts w:asciiTheme="minorHAnsi" w:hAnsiTheme="minorHAnsi" w:cstheme="minorHAnsi"/>
                   <w:color w:val="auto"/>
                   <w:sz w:val="20"/>
                   <w:szCs w:val="18"/>
@@ -1535,7 +1570,7 @@
             </w:sdt>
             <w:r>
               <w:rPr>
-                <w:rFonts w:ascii="Century Gothic" w:hAnsi="Century Gothic"/>
+                <w:rFonts w:asciiTheme="minorHAnsi" w:hAnsiTheme="minorHAnsi" w:cstheme="minorHAnsi"/>
                 <w:color w:val="auto"/>
                 <w:sz w:val="20"/>
                 <w:szCs w:val="18"/>
@@ -1555,7 +1590,7 @@
               <w:pStyle w:val="p1"/>
               <w:jc w:val="center"/>
               <w:rPr>
-                <w:rFonts w:ascii="Century Gothic" w:hAnsi="Century Gothic"/>
+                <w:rFonts w:asciiTheme="minorHAnsi" w:hAnsiTheme="minorHAnsi" w:cstheme="minorHAnsi"/>
                 <w:color w:val="auto"/>
                 <w:sz w:val="20"/>
                 <w:szCs w:val="18"/>
@@ -1581,16 +1616,16 @@
             <w:pPr>
               <w:pStyle w:val="p1"/>
               <w:rPr>
-                <w:rFonts w:ascii="Century Gothic" w:hAnsi="Century Gothic"/>
-                <w:b/>
-                <w:bCs/>
-                <w:color w:val="auto"/>
-                <w:sz w:val="20"/>
-              </w:rPr>
-            </w:pPr>
-            <w:r>
-              <w:rPr>
-                <w:rFonts w:ascii="Century Gothic" w:hAnsi="Century Gothic"/>
+                <w:rFonts w:asciiTheme="minorHAnsi" w:hAnsiTheme="minorHAnsi" w:cstheme="minorHAnsi"/>
+                <w:b/>
+                <w:bCs/>
+                <w:color w:val="auto"/>
+                <w:sz w:val="20"/>
+              </w:rPr>
+            </w:pPr>
+            <w:r>
+              <w:rPr>
+                <w:rFonts w:asciiTheme="minorHAnsi" w:hAnsiTheme="minorHAnsi" w:cstheme="minorHAnsi"/>
                 <w:b/>
                 <w:bCs/>
                 <w:color w:val="auto"/>
@@ -1601,7 +1636,7 @@
             </w:r>
             <w:r>
               <w:rPr>
-                <w:rFonts w:ascii="Century Gothic" w:hAnsi="Century Gothic"/>
+                <w:rFonts w:asciiTheme="minorHAnsi" w:hAnsiTheme="minorHAnsi" w:cstheme="minorHAnsi"/>
                 <w:b/>
                 <w:bCs/>
                 <w:color w:val="auto"/>
@@ -1634,20 +1669,60 @@
             <w:pPr>
               <w:pStyle w:val="p1"/>
               <w:rPr>
-                <w:rFonts w:ascii="Century Gothic" w:hAnsi="Century Gothic"/>
-                <w:color w:val="auto"/>
-                <w:sz w:val="20"/>
-                <w:szCs w:val="18"/>
-              </w:rPr>
-            </w:pPr>
-            <w:r>
-              <w:rPr>
-                <w:rFonts w:ascii="Century Gothic" w:hAnsi="Century Gothic"/>
-                <w:color w:val="auto"/>
-                <w:sz w:val="20"/>
-                <w:szCs w:val="18"/>
-              </w:rPr>
-              <w:t>The SharePoint01 server (172.16.20.17) is confirmed compromised with an active webshell (spinstall0.aspx) installed within the web server's directory structure, allowing the attacker persistent remote access and execution capabilities.</w:t>
+                <w:rFonts w:asciiTheme="minorHAnsi" w:hAnsiTheme="minorHAnsi" w:cstheme="minorHAnsi"/>
+                <w:color w:val="auto"/>
+                <w:sz w:val="20"/>
+                <w:szCs w:val="18"/>
+              </w:rPr>
+            </w:pPr>
+            <w:r>
+              <w:rPr>
+                <w:rFonts w:asciiTheme="minorHAnsi" w:hAnsiTheme="minorHAnsi" w:cstheme="minorHAnsi"/>
+                <w:color w:val="auto"/>
+                <w:sz w:val="20"/>
+                <w:szCs w:val="18"/>
+              </w:rPr>
+              <w:t xml:space="preserve">The SharePoint01 server (172.16.20.17) is confirmed </w:t>
+            </w:r>
+            <w:proofErr w:type="gramStart"/>
+            <w:r>
+              <w:rPr>
+                <w:rFonts w:asciiTheme="minorHAnsi" w:hAnsiTheme="minorHAnsi" w:cstheme="minorHAnsi"/>
+                <w:color w:val="auto"/>
+                <w:sz w:val="20"/>
+                <w:szCs w:val="18"/>
+              </w:rPr>
+              <w:t>compromised</w:t>
+            </w:r>
+            <w:proofErr w:type="gramEnd"/>
+            <w:r>
+              <w:rPr>
+                <w:rFonts w:asciiTheme="minorHAnsi" w:hAnsiTheme="minorHAnsi" w:cstheme="minorHAnsi"/>
+                <w:color w:val="auto"/>
+                <w:sz w:val="20"/>
+                <w:szCs w:val="18"/>
+              </w:rPr>
+              <w:t xml:space="preserve"> with an active </w:t>
+            </w:r>
+            <w:proofErr w:type="spellStart"/>
+            <w:r>
+              <w:rPr>
+                <w:rFonts w:asciiTheme="minorHAnsi" w:hAnsiTheme="minorHAnsi" w:cstheme="minorHAnsi"/>
+                <w:color w:val="auto"/>
+                <w:sz w:val="20"/>
+                <w:szCs w:val="18"/>
+              </w:rPr>
+              <w:t>webshell</w:t>
+            </w:r>
+            <w:proofErr w:type="spellEnd"/>
+            <w:r>
+              <w:rPr>
+                <w:rFonts w:asciiTheme="minorHAnsi" w:hAnsiTheme="minorHAnsi" w:cstheme="minorHAnsi"/>
+                <w:color w:val="auto"/>
+                <w:sz w:val="20"/>
+                <w:szCs w:val="18"/>
+              </w:rPr>
+              <w:t xml:space="preserve"> (spinstall0.aspx) installed within the web server's directory structure, allowing the attacker persistent remote access and execution capabilities.</w:t>
             </w:r>
           </w:p>
         </w:tc>
@@ -1657,7 +1732,7 @@
       <w:pPr>
         <w:spacing w:after="0"/>
         <w:rPr>
-          <w:rFonts w:ascii="Century Gothic" w:hAnsi="Century Gothic"/>
+          <w:rFonts w:cstheme="minorHAnsi"/>
           <w:sz w:val="18"/>
           <w:szCs w:val="18"/>
         </w:rPr>
@@ -1681,9 +1756,9 @@
       <w:tblGrid>
         <w:gridCol w:w="2205"/>
         <w:gridCol w:w="1490"/>
-        <w:gridCol w:w="270"/>
-        <w:gridCol w:w="355"/>
-        <w:gridCol w:w="270"/>
+        <w:gridCol w:w="625"/>
+        <w:gridCol w:w="185"/>
+        <w:gridCol w:w="85"/>
         <w:gridCol w:w="6300"/>
       </w:tblGrid>
       <w:tr>
@@ -1702,7 +1777,7 @@
               <w:pStyle w:val="p1"/>
               <w:jc w:val="center"/>
               <w:rPr>
-                <w:rFonts w:ascii="Century Gothic" w:hAnsi="Century Gothic"/>
+                <w:rFonts w:asciiTheme="minorHAnsi" w:hAnsiTheme="minorHAnsi" w:cstheme="minorHAnsi"/>
                 <w:b/>
                 <w:bCs/>
                 <w:color w:val="1F4E79" w:themeColor="accent5" w:themeShade="80"/>
@@ -1711,7 +1786,7 @@
             </w:pPr>
             <w:r>
               <w:rPr>
-                <w:rFonts w:ascii="Century Gothic" w:hAnsi="Century Gothic"/>
+                <w:rFonts w:asciiTheme="minorHAnsi" w:hAnsiTheme="minorHAnsi" w:cstheme="minorHAnsi"/>
                 <w:b/>
                 <w:bCs/>
                 <w:color w:val="auto"/>
@@ -1728,14 +1803,14 @@
         <w:tc>
           <w:tcPr>
             <w:tcW w:w="4320" w:type="dxa"/>
-            <w:gridSpan w:val="4"/>
+            <w:gridSpan w:val="3"/>
             <w:vAlign w:val="bottom"/>
           </w:tcPr>
           <w:p>
             <w:pPr>
               <w:pStyle w:val="p1"/>
               <w:rPr>
-                <w:rFonts w:ascii="Century Gothic" w:hAnsi="Century Gothic"/>
+                <w:rFonts w:asciiTheme="minorHAnsi" w:hAnsiTheme="minorHAnsi" w:cstheme="minorHAnsi"/>
                 <w:b/>
                 <w:bCs/>
                 <w:color w:val="3B3838" w:themeColor="background2" w:themeShade="40"/>
@@ -1744,7 +1819,7 @@
             </w:pPr>
             <w:r>
               <w:rPr>
-                <w:rFonts w:ascii="Century Gothic" w:hAnsi="Century Gothic"/>
+                <w:rFonts w:asciiTheme="minorHAnsi" w:hAnsiTheme="minorHAnsi" w:cstheme="minorHAnsi"/>
                 <w:b/>
                 <w:bCs/>
                 <w:color w:val="3B3838" w:themeColor="background2" w:themeShade="40"/>
@@ -1758,13 +1833,14 @@
         <w:tc>
           <w:tcPr>
             <w:tcW w:w="270" w:type="dxa"/>
+            <w:gridSpan w:val="2"/>
             <w:vAlign w:val="bottom"/>
           </w:tcPr>
           <w:p>
             <w:pPr>
               <w:pStyle w:val="p1"/>
               <w:rPr>
-                <w:rFonts w:ascii="Century Gothic" w:hAnsi="Century Gothic"/>
+                <w:rFonts w:asciiTheme="minorHAnsi" w:hAnsiTheme="minorHAnsi" w:cstheme="minorHAnsi"/>
                 <w:b/>
                 <w:bCs/>
                 <w:color w:val="3B3838" w:themeColor="background2" w:themeShade="40"/>
@@ -1782,7 +1858,7 @@
             <w:pPr>
               <w:pStyle w:val="p1"/>
               <w:rPr>
-                <w:rFonts w:ascii="Century Gothic" w:hAnsi="Century Gothic"/>
+                <w:rFonts w:asciiTheme="minorHAnsi" w:hAnsiTheme="minorHAnsi" w:cstheme="minorHAnsi"/>
                 <w:b/>
                 <w:bCs/>
                 <w:color w:val="3B3838" w:themeColor="background2" w:themeShade="40"/>
@@ -1791,25 +1867,14 @@
             </w:pPr>
             <w:r>
               <w:rPr>
-                <w:rFonts w:ascii="Century Gothic" w:hAnsi="Century Gothic"/>
+                <w:rFonts w:asciiTheme="minorHAnsi" w:hAnsiTheme="minorHAnsi" w:cstheme="minorHAnsi"/>
                 <w:b/>
                 <w:bCs/>
                 <w:color w:val="3B3838" w:themeColor="background2" w:themeShade="40"/>
                 <w:sz w:val="20"/>
                 <w:szCs w:val="20"/>
               </w:rPr>
-              <w:t>Date/time of notification</w:t>
-            </w:r>
-            <w:r>
-              <w:rPr>
-                <w:rFonts w:ascii="Century Gothic" w:hAnsi="Century Gothic"/>
-                <w:b/>
-                <w:bCs/>
-                <w:color w:val="3B3838" w:themeColor="background2" w:themeShade="40"/>
-                <w:sz w:val="20"/>
-                <w:szCs w:val="20"/>
-              </w:rPr>
-              <w:t>:</w:t>
+              <w:t>Date/time of notification:</w:t>
             </w:r>
           </w:p>
         </w:tc>
@@ -1828,7 +1893,7 @@
               <w:pStyle w:val="p1"/>
               <w:jc w:val="center"/>
               <w:rPr>
-                <w:rFonts w:ascii="Century Gothic" w:hAnsi="Century Gothic"/>
+                <w:rFonts w:asciiTheme="minorHAnsi" w:hAnsiTheme="minorHAnsi" w:cstheme="minorHAnsi"/>
                 <w:color w:val="auto"/>
                 <w:sz w:val="20"/>
                 <w:szCs w:val="18"/>
@@ -1837,7 +1902,7 @@
             <w:sdt>
               <w:sdtPr>
                 <w:rPr>
-                  <w:rFonts w:ascii="Century Gothic" w:hAnsi="Century Gothic"/>
+                  <w:rFonts w:asciiTheme="minorHAnsi" w:hAnsiTheme="minorHAnsi" w:cstheme="minorHAnsi"/>
                   <w:color w:val="auto"/>
                   <w:sz w:val="20"/>
                   <w:szCs w:val="18"/>
@@ -1852,7 +1917,7 @@
               <w:sdtContent>
                 <w:r>
                   <w:rPr>
-                    <w:rFonts w:ascii="MS Gothic" w:eastAsia="MS Gothic" w:hAnsi="MS Gothic" w:hint="eastAsia"/>
+                    <w:rFonts w:ascii="Segoe UI Symbol" w:eastAsia="MS Gothic" w:hAnsi="Segoe UI Symbol" w:cs="Segoe UI Symbol"/>
                     <w:color w:val="auto"/>
                     <w:sz w:val="20"/>
                     <w:szCs w:val="18"/>
@@ -1863,21 +1928,12 @@
             </w:sdt>
             <w:r>
               <w:rPr>
-                <w:rFonts w:ascii="Century Gothic" w:hAnsi="Century Gothic"/>
-                <w:color w:val="auto"/>
-                <w:sz w:val="20"/>
-                <w:szCs w:val="18"/>
-              </w:rPr>
-              <w:t xml:space="preserve"> </w:t>
-            </w:r>
-            <w:r>
-              <w:rPr>
-                <w:rFonts w:ascii="Century Gothic" w:hAnsi="Century Gothic"/>
-                <w:color w:val="auto"/>
-                <w:sz w:val="20"/>
-                <w:szCs w:val="18"/>
-              </w:rPr>
-              <w:t>Yes</w:t>
+                <w:rFonts w:asciiTheme="minorHAnsi" w:hAnsiTheme="minorHAnsi" w:cstheme="minorHAnsi"/>
+                <w:color w:val="auto"/>
+                <w:sz w:val="20"/>
+                <w:szCs w:val="18"/>
+              </w:rPr>
+              <w:t xml:space="preserve"> Yes</w:t>
             </w:r>
           </w:p>
         </w:tc>
@@ -1891,7 +1947,7 @@
               <w:pStyle w:val="p1"/>
               <w:jc w:val="center"/>
               <w:rPr>
-                <w:rFonts w:ascii="Century Gothic" w:hAnsi="Century Gothic"/>
+                <w:rFonts w:asciiTheme="minorHAnsi" w:hAnsiTheme="minorHAnsi" w:cstheme="minorHAnsi"/>
                 <w:color w:val="auto"/>
                 <w:sz w:val="20"/>
                 <w:szCs w:val="18"/>
@@ -1900,7 +1956,7 @@
             <w:sdt>
               <w:sdtPr>
                 <w:rPr>
-                  <w:rFonts w:ascii="Century Gothic" w:hAnsi="Century Gothic"/>
+                  <w:rFonts w:asciiTheme="minorHAnsi" w:hAnsiTheme="minorHAnsi" w:cstheme="minorHAnsi"/>
                   <w:color w:val="auto"/>
                   <w:sz w:val="20"/>
                   <w:szCs w:val="18"/>
@@ -1915,7 +1971,7 @@
               <w:sdtContent>
                 <w:r>
                   <w:rPr>
-                    <w:rFonts w:ascii="MS Gothic" w:eastAsia="MS Gothic" w:hAnsi="MS Gothic" w:hint="eastAsia"/>
+                    <w:rFonts w:ascii="Segoe UI Symbol" w:eastAsia="MS Gothic" w:hAnsi="Segoe UI Symbol" w:cs="Segoe UI Symbol"/>
                     <w:color w:val="auto"/>
                     <w:sz w:val="20"/>
                     <w:szCs w:val="18"/>
@@ -1926,21 +1982,12 @@
             </w:sdt>
             <w:r>
               <w:rPr>
-                <w:rFonts w:ascii="Century Gothic" w:hAnsi="Century Gothic"/>
-                <w:color w:val="auto"/>
-                <w:sz w:val="20"/>
-                <w:szCs w:val="18"/>
-              </w:rPr>
-              <w:t xml:space="preserve"> </w:t>
-            </w:r>
-            <w:r>
-              <w:rPr>
-                <w:rFonts w:ascii="Century Gothic" w:hAnsi="Century Gothic"/>
-                <w:color w:val="auto"/>
-                <w:sz w:val="20"/>
-                <w:szCs w:val="18"/>
-              </w:rPr>
-              <w:t>No</w:t>
+                <w:rFonts w:asciiTheme="minorHAnsi" w:hAnsiTheme="minorHAnsi" w:cstheme="minorHAnsi"/>
+                <w:color w:val="auto"/>
+                <w:sz w:val="20"/>
+                <w:szCs w:val="18"/>
+              </w:rPr>
+              <w:t xml:space="preserve"> No</w:t>
             </w:r>
           </w:p>
         </w:tc>
@@ -1954,7 +2001,7 @@
             <w:pPr>
               <w:pStyle w:val="p1"/>
               <w:rPr>
-                <w:rFonts w:ascii="Century Gothic" w:hAnsi="Century Gothic"/>
+                <w:rFonts w:asciiTheme="minorHAnsi" w:hAnsiTheme="minorHAnsi" w:cstheme="minorHAnsi"/>
                 <w:color w:val="auto"/>
                 <w:sz w:val="20"/>
                 <w:szCs w:val="18"/>
@@ -1976,15 +2023,15 @@
               <w:pStyle w:val="p1"/>
               <w:ind w:left="720"/>
               <w:rPr>
-                <w:rFonts w:ascii="Century Gothic" w:hAnsi="Century Gothic"/>
-                <w:color w:val="auto"/>
-                <w:sz w:val="20"/>
-                <w:szCs w:val="18"/>
-              </w:rPr>
-            </w:pPr>
-            <w:r>
-              <w:rPr>
-                <w:rFonts w:ascii="Century Gothic" w:hAnsi="Century Gothic"/>
+                <w:rFonts w:asciiTheme="minorHAnsi" w:hAnsiTheme="minorHAnsi" w:cstheme="minorHAnsi"/>
+                <w:color w:val="auto"/>
+                <w:sz w:val="20"/>
+                <w:szCs w:val="18"/>
+              </w:rPr>
+            </w:pPr>
+            <w:r>
+              <w:rPr>
+                <w:rFonts w:asciiTheme="minorHAnsi" w:hAnsiTheme="minorHAnsi" w:cstheme="minorHAnsi"/>
                 <w:color w:val="auto"/>
                 <w:sz w:val="20"/>
                 <w:szCs w:val="18"/>
@@ -2008,7 +2055,7 @@
             <w:pPr>
               <w:pStyle w:val="p1"/>
               <w:rPr>
-                <w:rFonts w:ascii="Century Gothic" w:hAnsi="Century Gothic"/>
+                <w:rFonts w:asciiTheme="minorHAnsi" w:hAnsiTheme="minorHAnsi" w:cstheme="minorHAnsi"/>
                 <w:b/>
                 <w:bCs/>
                 <w:color w:val="3B3838" w:themeColor="background2" w:themeShade="40"/>
@@ -2017,128 +2064,63 @@
             </w:pPr>
             <w:r>
               <w:rPr>
-                <w:rFonts w:ascii="Century Gothic" w:hAnsi="Century Gothic"/>
+                <w:rFonts w:asciiTheme="minorHAnsi" w:hAnsiTheme="minorHAnsi" w:cstheme="minorHAnsi"/>
                 <w:b/>
                 <w:bCs/>
                 <w:color w:val="3B3838" w:themeColor="background2" w:themeShade="40"/>
                 <w:sz w:val="20"/>
                 <w:szCs w:val="20"/>
               </w:rPr>
-              <w:t>Was the IT/</w:t>
-            </w:r>
-            <w:r>
-              <w:rPr>
-                <w:rFonts w:ascii="Century Gothic" w:hAnsi="Century Gothic"/>
+              <w:t>Was the IT/security team alerted?</w:t>
+            </w:r>
+          </w:p>
+        </w:tc>
+        <w:tc>
+          <w:tcPr>
+            <w:tcW w:w="810" w:type="dxa"/>
+            <w:gridSpan w:val="2"/>
+            <w:vAlign w:val="bottom"/>
+          </w:tcPr>
+          <w:p>
+            <w:pPr>
+              <w:pStyle w:val="p1"/>
+              <w:rPr>
+                <w:rFonts w:asciiTheme="minorHAnsi" w:hAnsiTheme="minorHAnsi" w:cstheme="minorHAnsi"/>
                 <w:b/>
                 <w:bCs/>
                 <w:color w:val="3B3838" w:themeColor="background2" w:themeShade="40"/>
                 <w:sz w:val="20"/>
+              </w:rPr>
+            </w:pPr>
+          </w:p>
+        </w:tc>
+        <w:tc>
+          <w:tcPr>
+            <w:tcW w:w="6385" w:type="dxa"/>
+            <w:gridSpan w:val="2"/>
+            <w:vAlign w:val="bottom"/>
+          </w:tcPr>
+          <w:p>
+            <w:pPr>
+              <w:pStyle w:val="p1"/>
+              <w:rPr>
+                <w:rFonts w:asciiTheme="minorHAnsi" w:hAnsiTheme="minorHAnsi" w:cstheme="minorHAnsi"/>
+                <w:b/>
+                <w:bCs/>
+                <w:color w:val="3B3838" w:themeColor="background2" w:themeShade="40"/>
+                <w:sz w:val="20"/>
+              </w:rPr>
+            </w:pPr>
+            <w:r>
+              <w:rPr>
+                <w:rFonts w:asciiTheme="minorHAnsi" w:hAnsiTheme="minorHAnsi" w:cstheme="minorHAnsi"/>
+                <w:b/>
+                <w:bCs/>
+                <w:color w:val="3B3838" w:themeColor="background2" w:themeShade="40"/>
+                <w:sz w:val="20"/>
                 <w:szCs w:val="20"/>
               </w:rPr>
-              <w:t>s</w:t>
-            </w:r>
-            <w:r>
-              <w:rPr>
-                <w:rFonts w:ascii="Century Gothic" w:hAnsi="Century Gothic"/>
-                <w:b/>
-                <w:bCs/>
-                <w:color w:val="3B3838" w:themeColor="background2" w:themeShade="40"/>
-                <w:sz w:val="20"/>
-                <w:szCs w:val="20"/>
-              </w:rPr>
-              <w:t xml:space="preserve">ecurity </w:t>
-            </w:r>
-            <w:r>
-              <w:rPr>
-                <w:rFonts w:ascii="Century Gothic" w:hAnsi="Century Gothic"/>
-                <w:b/>
-                <w:bCs/>
-                <w:color w:val="3B3838" w:themeColor="background2" w:themeShade="40"/>
-                <w:sz w:val="20"/>
-                <w:szCs w:val="20"/>
-              </w:rPr>
-              <w:t>t</w:t>
-            </w:r>
-            <w:r>
-              <w:rPr>
-                <w:rFonts w:ascii="Century Gothic" w:hAnsi="Century Gothic"/>
-                <w:b/>
-                <w:bCs/>
-                <w:color w:val="3B3838" w:themeColor="background2" w:themeShade="40"/>
-                <w:sz w:val="20"/>
-                <w:szCs w:val="20"/>
-              </w:rPr>
-              <w:t>eam alerted?</w:t>
-            </w:r>
-          </w:p>
-        </w:tc>
-        <w:tc>
-          <w:tcPr>
-            <w:tcW w:w="270" w:type="dxa"/>
-            <w:vAlign w:val="bottom"/>
-          </w:tcPr>
-          <w:p>
-            <w:pPr>
-              <w:pStyle w:val="p1"/>
-              <w:rPr>
-                <w:rFonts w:ascii="Century Gothic" w:hAnsi="Century Gothic"/>
-                <w:b/>
-                <w:bCs/>
-                <w:color w:val="3B3838" w:themeColor="background2" w:themeShade="40"/>
-                <w:sz w:val="20"/>
-              </w:rPr>
-            </w:pPr>
-          </w:p>
-        </w:tc>
-        <w:tc>
-          <w:tcPr>
-            <w:tcW w:w="6925" w:type="dxa"/>
-            <w:gridSpan w:val="3"/>
-            <w:vAlign w:val="bottom"/>
-          </w:tcPr>
-          <w:p>
-            <w:pPr>
-              <w:pStyle w:val="p1"/>
-              <w:rPr>
-                <w:rFonts w:ascii="Century Gothic" w:hAnsi="Century Gothic"/>
-                <w:b/>
-                <w:bCs/>
-                <w:color w:val="3B3838" w:themeColor="background2" w:themeShade="40"/>
-                <w:sz w:val="20"/>
-              </w:rPr>
-            </w:pPr>
-            <w:r>
-              <w:rPr>
-                <w:rFonts w:ascii="Century Gothic" w:hAnsi="Century Gothic"/>
-                <w:b/>
-                <w:bCs/>
-                <w:color w:val="3B3838" w:themeColor="background2" w:themeShade="40"/>
-                <w:sz w:val="20"/>
-                <w:szCs w:val="20"/>
-              </w:rPr>
-              <w:t>If yes, who was contacted and how</w:t>
-            </w:r>
-            <w:r>
-              <w:rPr>
-                <w:rFonts w:ascii="Century Gothic" w:hAnsi="Century Gothic"/>
-                <w:b/>
-                <w:bCs/>
-                <w:color w:val="3B3838" w:themeColor="background2" w:themeShade="40"/>
-                <w:sz w:val="20"/>
-                <w:szCs w:val="20"/>
-              </w:rPr>
-              <w:t>?</w:t>
-            </w:r>
-            <w:r>
-              <w:rPr>
-                <w:rFonts w:ascii="Century Gothic" w:hAnsi="Century Gothic"/>
-                <w:b/>
-                <w:bCs/>
-                <w:color w:val="3B3838" w:themeColor="background2" w:themeShade="40"/>
-                <w:sz w:val="20"/>
-                <w:szCs w:val="20"/>
-              </w:rPr>
-              <w:t xml:space="preserve"> (e.g., email, phone, ticket)</w:t>
+              <w:t>If yes, who was contacted and how? (e.g., email, phone, ticket)</w:t>
             </w:r>
           </w:p>
         </w:tc>
@@ -2157,7 +2139,7 @@
               <w:pStyle w:val="p1"/>
               <w:jc w:val="center"/>
               <w:rPr>
-                <w:rFonts w:ascii="Century Gothic" w:hAnsi="Century Gothic"/>
+                <w:rFonts w:asciiTheme="minorHAnsi" w:hAnsiTheme="minorHAnsi" w:cstheme="minorHAnsi"/>
                 <w:color w:val="auto"/>
                 <w:sz w:val="20"/>
                 <w:szCs w:val="18"/>
@@ -2166,7 +2148,7 @@
             <w:sdt>
               <w:sdtPr>
                 <w:rPr>
-                  <w:rFonts w:ascii="Century Gothic" w:hAnsi="Century Gothic"/>
+                  <w:rFonts w:asciiTheme="minorHAnsi" w:hAnsiTheme="minorHAnsi" w:cstheme="minorHAnsi"/>
                   <w:color w:val="auto"/>
                   <w:sz w:val="20"/>
                   <w:szCs w:val="18"/>
@@ -2181,7 +2163,7 @@
               <w:sdtContent>
                 <w:r>
                   <w:rPr>
-                    <w:rFonts w:ascii="MS Gothic" w:eastAsia="MS Gothic" w:hAnsi="MS Gothic" w:hint="eastAsia"/>
+                    <w:rFonts w:ascii="Segoe UI Symbol" w:eastAsia="MS Gothic" w:hAnsi="Segoe UI Symbol" w:cs="Segoe UI Symbol"/>
                     <w:color w:val="auto"/>
                     <w:sz w:val="20"/>
                     <w:szCs w:val="18"/>
@@ -2192,21 +2174,12 @@
             </w:sdt>
             <w:r>
               <w:rPr>
-                <w:rFonts w:ascii="Century Gothic" w:hAnsi="Century Gothic"/>
-                <w:color w:val="auto"/>
-                <w:sz w:val="20"/>
-                <w:szCs w:val="18"/>
-              </w:rPr>
-              <w:t xml:space="preserve"> </w:t>
-            </w:r>
-            <w:r>
-              <w:rPr>
-                <w:rFonts w:ascii="Century Gothic" w:hAnsi="Century Gothic"/>
-                <w:color w:val="auto"/>
-                <w:sz w:val="20"/>
-                <w:szCs w:val="18"/>
-              </w:rPr>
-              <w:t>Yes</w:t>
+                <w:rFonts w:asciiTheme="minorHAnsi" w:hAnsiTheme="minorHAnsi" w:cstheme="minorHAnsi"/>
+                <w:color w:val="auto"/>
+                <w:sz w:val="20"/>
+                <w:szCs w:val="18"/>
+              </w:rPr>
+              <w:t xml:space="preserve"> Yes</w:t>
             </w:r>
           </w:p>
         </w:tc>
@@ -2220,7 +2193,7 @@
               <w:pStyle w:val="p1"/>
               <w:jc w:val="center"/>
               <w:rPr>
-                <w:rFonts w:ascii="Century Gothic" w:hAnsi="Century Gothic"/>
+                <w:rFonts w:asciiTheme="minorHAnsi" w:hAnsiTheme="minorHAnsi" w:cstheme="minorHAnsi"/>
                 <w:color w:val="auto"/>
                 <w:sz w:val="20"/>
                 <w:szCs w:val="18"/>
@@ -2229,7 +2202,7 @@
             <w:sdt>
               <w:sdtPr>
                 <w:rPr>
-                  <w:rFonts w:ascii="Century Gothic" w:hAnsi="Century Gothic"/>
+                  <w:rFonts w:asciiTheme="minorHAnsi" w:hAnsiTheme="minorHAnsi" w:cstheme="minorHAnsi"/>
                   <w:color w:val="auto"/>
                   <w:sz w:val="20"/>
                   <w:szCs w:val="18"/>
@@ -2244,7 +2217,7 @@
               <w:sdtContent>
                 <w:r>
                   <w:rPr>
-                    <w:rFonts w:ascii="MS Gothic" w:eastAsia="MS Gothic" w:hAnsi="MS Gothic" w:hint="eastAsia"/>
+                    <w:rFonts w:ascii="Segoe UI Symbol" w:eastAsia="MS Gothic" w:hAnsi="Segoe UI Symbol" w:cs="Segoe UI Symbol"/>
                     <w:color w:val="auto"/>
                     <w:sz w:val="20"/>
                     <w:szCs w:val="18"/>
@@ -2255,45 +2228,47 @@
             </w:sdt>
             <w:r>
               <w:rPr>
-                <w:rFonts w:ascii="Century Gothic" w:hAnsi="Century Gothic"/>
-                <w:color w:val="auto"/>
-                <w:sz w:val="20"/>
-                <w:szCs w:val="18"/>
+                <w:rFonts w:asciiTheme="minorHAnsi" w:hAnsiTheme="minorHAnsi" w:cstheme="minorHAnsi"/>
+                <w:color w:val="auto"/>
+                <w:sz w:val="20"/>
+                <w:szCs w:val="18"/>
+              </w:rPr>
+              <w:t xml:space="preserve"> No</w:t>
+            </w:r>
+          </w:p>
+        </w:tc>
+        <w:tc>
+          <w:tcPr>
+            <w:tcW w:w="810" w:type="dxa"/>
+            <w:gridSpan w:val="2"/>
+            <w:vAlign w:val="center"/>
+          </w:tcPr>
+          <w:p>
+            <w:pPr>
+              <w:pStyle w:val="p1"/>
+              <w:rPr>
+                <w:rFonts w:asciiTheme="minorHAnsi" w:hAnsiTheme="minorHAnsi" w:cstheme="minorHAnsi"/>
+                <w:color w:val="auto"/>
+                <w:sz w:val="20"/>
+                <w:szCs w:val="18"/>
+              </w:rPr>
+            </w:pPr>
+            <w:r>
+              <w:rPr>
+                <w:rFonts w:asciiTheme="minorHAnsi" w:hAnsiTheme="minorHAnsi" w:cstheme="minorHAnsi" w:hint="cs"/>
+                <w:color w:val="auto"/>
+                <w:sz w:val="20"/>
+                <w:szCs w:val="18"/>
+                <w:rtl/>
               </w:rPr>
               <w:t xml:space="preserve"> </w:t>
             </w:r>
-            <w:r>
-              <w:rPr>
-                <w:rFonts w:ascii="Century Gothic" w:hAnsi="Century Gothic"/>
-                <w:color w:val="auto"/>
-                <w:sz w:val="20"/>
-                <w:szCs w:val="18"/>
-              </w:rPr>
-              <w:t>No</w:t>
-            </w:r>
-          </w:p>
-        </w:tc>
-        <w:tc>
-          <w:tcPr>
-            <w:tcW w:w="270" w:type="dxa"/>
-            <w:vAlign w:val="center"/>
-          </w:tcPr>
-          <w:p>
-            <w:pPr>
-              <w:pStyle w:val="p1"/>
-              <w:rPr>
-                <w:rFonts w:ascii="Century Gothic" w:hAnsi="Century Gothic"/>
-                <w:color w:val="auto"/>
-                <w:sz w:val="20"/>
-                <w:szCs w:val="18"/>
-              </w:rPr>
-            </w:pPr>
-          </w:p>
-        </w:tc>
-        <w:tc>
-          <w:tcPr>
-            <w:tcW w:w="6925" w:type="dxa"/>
-            <w:gridSpan w:val="3"/>
+          </w:p>
+        </w:tc>
+        <w:tc>
+          <w:tcPr>
+            <w:tcW w:w="6385" w:type="dxa"/>
+            <w:gridSpan w:val="2"/>
             <w:tcBorders>
               <w:bottom w:val="single" w:sz="4" w:space="0" w:color="A6A6A6" w:themeColor="background1" w:themeShade="A6"/>
             </w:tcBorders>
@@ -2305,29 +2280,20 @@
               <w:pStyle w:val="p1"/>
               <w:ind w:left="720"/>
               <w:rPr>
-                <w:rFonts w:ascii="Century Gothic" w:hAnsi="Century Gothic"/>
-                <w:color w:val="auto"/>
-                <w:sz w:val="20"/>
-                <w:szCs w:val="18"/>
-              </w:rPr>
-            </w:pPr>
-            <w:r>
-              <w:rPr>
-                <w:rFonts w:ascii="Century Gothic" w:hAnsi="Century Gothic"/>
-                <w:color w:val="auto"/>
-                <w:sz w:val="20"/>
-                <w:szCs w:val="18"/>
-              </w:rPr>
-              <w:t>Escalated to the Incident Response team</w:t>
-            </w:r>
-            <w:r>
-              <w:rPr>
-                <w:rFonts w:ascii="Century Gothic" w:hAnsi="Century Gothic"/>
-                <w:color w:val="auto"/>
-                <w:sz w:val="20"/>
-                <w:szCs w:val="18"/>
-              </w:rPr>
-              <w:t>.</w:t>
+                <w:rFonts w:asciiTheme="minorHAnsi" w:hAnsiTheme="minorHAnsi" w:cstheme="minorHAnsi"/>
+                <w:color w:val="auto"/>
+                <w:sz w:val="20"/>
+                <w:szCs w:val="18"/>
+              </w:rPr>
+            </w:pPr>
+            <w:r>
+              <w:rPr>
+                <w:rFonts w:asciiTheme="minorHAnsi" w:hAnsiTheme="minorHAnsi" w:cstheme="minorHAnsi"/>
+                <w:color w:val="auto"/>
+                <w:sz w:val="20"/>
+                <w:szCs w:val="18"/>
+              </w:rPr>
+              <w:t>Escalated to the Incident Response team.</w:t>
             </w:r>
           </w:p>
         </w:tc>
@@ -2337,7 +2303,7 @@
       <w:pPr>
         <w:spacing w:after="0"/>
         <w:rPr>
-          <w:rFonts w:ascii="Century Gothic" w:hAnsi="Century Gothic"/>
+          <w:rFonts w:cstheme="minorHAnsi"/>
           <w:sz w:val="18"/>
           <w:szCs w:val="18"/>
         </w:rPr>
@@ -2380,15 +2346,15 @@
               <w:pStyle w:val="p1"/>
               <w:jc w:val="center"/>
               <w:rPr>
-                <w:rFonts w:ascii="Century Gothic" w:hAnsi="Century Gothic"/>
-                <w:b/>
-                <w:bCs/>
-                <w:color w:val="auto"/>
-              </w:rPr>
-            </w:pPr>
-            <w:r>
-              <w:rPr>
-                <w:rFonts w:ascii="Century Gothic" w:hAnsi="Century Gothic"/>
+                <w:rFonts w:asciiTheme="minorHAnsi" w:hAnsiTheme="minorHAnsi" w:cstheme="minorHAnsi"/>
+                <w:b/>
+                <w:bCs/>
+                <w:color w:val="auto"/>
+              </w:rPr>
+            </w:pPr>
+            <w:r>
+              <w:rPr>
+                <w:rFonts w:asciiTheme="minorHAnsi" w:hAnsiTheme="minorHAnsi" w:cstheme="minorHAnsi"/>
                 <w:b/>
                 <w:bCs/>
                 <w:color w:val="auto"/>
@@ -2415,7 +2381,7 @@
             <w:pPr>
               <w:pStyle w:val="p1"/>
               <w:rPr>
-                <w:rFonts w:ascii="Century Gothic" w:hAnsi="Century Gothic"/>
+                <w:rFonts w:asciiTheme="minorHAnsi" w:hAnsiTheme="minorHAnsi" w:cstheme="minorHAnsi"/>
                 <w:b/>
                 <w:bCs/>
                 <w:color w:val="3B3838" w:themeColor="background2" w:themeShade="40"/>
@@ -2424,7 +2390,7 @@
             </w:pPr>
             <w:r>
               <w:rPr>
-                <w:rFonts w:ascii="Century Gothic" w:hAnsi="Century Gothic"/>
+                <w:rFonts w:asciiTheme="minorHAnsi" w:hAnsiTheme="minorHAnsi" w:cstheme="minorHAnsi"/>
                 <w:b/>
                 <w:bCs/>
                 <w:color w:val="3B3838" w:themeColor="background2" w:themeShade="40"/>
@@ -2435,7 +2401,7 @@
             </w:r>
             <w:r>
               <w:rPr>
-                <w:rFonts w:ascii="Century Gothic" w:hAnsi="Century Gothic"/>
+                <w:rFonts w:asciiTheme="minorHAnsi" w:hAnsiTheme="minorHAnsi" w:cstheme="minorHAnsi"/>
                 <w:b/>
                 <w:bCs/>
                 <w:color w:val="3B3838" w:themeColor="background2" w:themeShade="40"/>
@@ -2446,7 +2412,7 @@
             </w:r>
             <w:r>
               <w:rPr>
-                <w:rFonts w:ascii="Century Gothic" w:hAnsi="Century Gothic"/>
+                <w:rFonts w:asciiTheme="minorHAnsi" w:hAnsiTheme="minorHAnsi" w:cstheme="minorHAnsi"/>
                 <w:b/>
                 <w:bCs/>
                 <w:color w:val="3B3838" w:themeColor="background2" w:themeShade="40"/>
@@ -2478,44 +2444,52 @@
           <w:p>
             <w:pPr>
               <w:pStyle w:val="p1"/>
-              <w:rPr>
-                <w:rFonts w:ascii="Century Gothic" w:hAnsi="Century Gothic"/>
-                <w:sz w:val="20"/>
-                <w:szCs w:val="18"/>
-              </w:rPr>
-            </w:pPr>
-            <w:r>
-              <w:rPr>
-                <w:rFonts w:ascii="Century Gothic" w:hAnsi="Century Gothic"/>
-                <w:sz w:val="20"/>
-                <w:szCs w:val="18"/>
-              </w:rPr>
-              <w:t>  Immediately isolate SharePoint01 (172.16.20.17) from the network to halt lateral movement and sever the attacker's active command and control (C2) connection.</w:t>
-            </w:r>
-          </w:p>
-          <w:p>
-            <w:pPr>
-              <w:pStyle w:val="p1"/>
-              <w:rPr>
-                <w:rFonts w:ascii="Century Gothic" w:hAnsi="Century Gothic"/>
-                <w:sz w:val="20"/>
-                <w:szCs w:val="18"/>
-              </w:rPr>
-            </w:pPr>
-            <w:r>
-              <w:rPr>
-                <w:rFonts w:ascii="Century Gothic" w:hAnsi="Century Gothic"/>
-                <w:sz w:val="20"/>
-                <w:szCs w:val="18"/>
-              </w:rPr>
-              <w:t>  Block the malicious IP address 107.191.58.76 on all perimeter firewalls and Web Application Firewalls (WAF).</w:t>
-            </w:r>
-          </w:p>
-          <w:p>
-            <w:pPr>
-              <w:pStyle w:val="p1"/>
-              <w:rPr>
-                <w:rFonts w:ascii="Century Gothic" w:hAnsi="Century Gothic"/>
+              <w:numPr>
+                <w:ilvl w:val="0"/>
+                <w:numId w:val="9"/>
+              </w:numPr>
+              <w:rPr>
+                <w:rFonts w:asciiTheme="minorHAnsi" w:hAnsiTheme="minorHAnsi" w:cstheme="minorHAnsi"/>
+                <w:sz w:val="20"/>
+                <w:szCs w:val="18"/>
+              </w:rPr>
+            </w:pPr>
+            <w:r>
+              <w:rPr>
+                <w:rFonts w:asciiTheme="minorHAnsi" w:hAnsiTheme="minorHAnsi" w:cstheme="minorHAnsi"/>
+                <w:sz w:val="20"/>
+                <w:szCs w:val="18"/>
+              </w:rPr>
+              <w:t>Immediately isolate SharePoint01 (172.16.20.17) from the network to halt lateral movement and sever the attacker's active command and control (C2) connection.</w:t>
+            </w:r>
+          </w:p>
+          <w:p>
+            <w:pPr>
+              <w:pStyle w:val="p1"/>
+              <w:numPr>
+                <w:ilvl w:val="0"/>
+                <w:numId w:val="9"/>
+              </w:numPr>
+              <w:rPr>
+                <w:rFonts w:asciiTheme="minorHAnsi" w:hAnsiTheme="minorHAnsi" w:cstheme="minorHAnsi"/>
+                <w:sz w:val="20"/>
+                <w:szCs w:val="18"/>
+              </w:rPr>
+            </w:pPr>
+            <w:r>
+              <w:rPr>
+                <w:rFonts w:asciiTheme="minorHAnsi" w:hAnsiTheme="minorHAnsi" w:cstheme="minorHAnsi"/>
+                <w:sz w:val="20"/>
+                <w:szCs w:val="18"/>
+              </w:rPr>
+              <w:t>Block the malicious IP address 107.191.58.76 on all perimeter firewalls and Web Application Firewalls (WAF).</w:t>
+            </w:r>
+          </w:p>
+          <w:p>
+            <w:pPr>
+              <w:pStyle w:val="p1"/>
+              <w:rPr>
+                <w:rFonts w:asciiTheme="minorHAnsi" w:hAnsiTheme="minorHAnsi" w:cstheme="minorHAnsi"/>
                 <w:color w:val="auto"/>
                 <w:sz w:val="20"/>
                 <w:szCs w:val="18"/>
@@ -2541,7 +2515,7 @@
             <w:pPr>
               <w:pStyle w:val="p1"/>
               <w:rPr>
-                <w:rFonts w:ascii="Century Gothic" w:hAnsi="Century Gothic"/>
+                <w:rFonts w:asciiTheme="minorHAnsi" w:hAnsiTheme="minorHAnsi" w:cstheme="minorHAnsi"/>
                 <w:b/>
                 <w:bCs/>
                 <w:color w:val="3B3838" w:themeColor="background2" w:themeShade="40"/>
@@ -2550,7 +2524,7 @@
             </w:pPr>
             <w:r>
               <w:rPr>
-                <w:rFonts w:ascii="Century Gothic" w:hAnsi="Century Gothic"/>
+                <w:rFonts w:asciiTheme="minorHAnsi" w:hAnsiTheme="minorHAnsi" w:cstheme="minorHAnsi"/>
                 <w:b/>
                 <w:bCs/>
                 <w:color w:val="3B3838" w:themeColor="background2" w:themeShade="40"/>
@@ -2573,7 +2547,7 @@
             <w:pPr>
               <w:pStyle w:val="p1"/>
               <w:rPr>
-                <w:rFonts w:ascii="Century Gothic" w:hAnsi="Century Gothic"/>
+                <w:rFonts w:asciiTheme="minorHAnsi" w:hAnsiTheme="minorHAnsi" w:cstheme="minorHAnsi"/>
                 <w:b/>
                 <w:bCs/>
                 <w:color w:val="3B3838" w:themeColor="background2" w:themeShade="40"/>
@@ -2597,7 +2571,7 @@
               <w:pStyle w:val="p1"/>
               <w:jc w:val="center"/>
               <w:rPr>
-                <w:rFonts w:ascii="Century Gothic" w:hAnsi="Century Gothic"/>
+                <w:rFonts w:asciiTheme="minorHAnsi" w:hAnsiTheme="minorHAnsi" w:cstheme="minorHAnsi"/>
                 <w:color w:val="auto"/>
                 <w:sz w:val="20"/>
                 <w:szCs w:val="18"/>
@@ -2606,7 +2580,7 @@
             <w:sdt>
               <w:sdtPr>
                 <w:rPr>
-                  <w:rFonts w:ascii="Century Gothic" w:hAnsi="Century Gothic"/>
+                  <w:rFonts w:asciiTheme="minorHAnsi" w:hAnsiTheme="minorHAnsi" w:cstheme="minorHAnsi"/>
                   <w:color w:val="auto"/>
                   <w:sz w:val="20"/>
                   <w:szCs w:val="18"/>
@@ -2621,7 +2595,7 @@
               <w:sdtContent>
                 <w:r>
                   <w:rPr>
-                    <w:rFonts w:ascii="MS Gothic" w:eastAsia="MS Gothic" w:hAnsi="MS Gothic" w:hint="eastAsia"/>
+                    <w:rFonts w:ascii="Segoe UI Symbol" w:eastAsia="MS Gothic" w:hAnsi="Segoe UI Symbol" w:cs="Segoe UI Symbol"/>
                     <w:color w:val="auto"/>
                     <w:sz w:val="20"/>
                     <w:szCs w:val="18"/>
@@ -2632,21 +2606,12 @@
             </w:sdt>
             <w:r>
               <w:rPr>
-                <w:rFonts w:ascii="Century Gothic" w:hAnsi="Century Gothic"/>
-                <w:color w:val="auto"/>
-                <w:sz w:val="20"/>
-                <w:szCs w:val="18"/>
-              </w:rPr>
-              <w:t xml:space="preserve"> </w:t>
-            </w:r>
-            <w:r>
-              <w:rPr>
-                <w:rFonts w:ascii="Century Gothic" w:hAnsi="Century Gothic"/>
-                <w:color w:val="auto"/>
-                <w:sz w:val="20"/>
-                <w:szCs w:val="18"/>
-              </w:rPr>
-              <w:t>Yes</w:t>
+                <w:rFonts w:asciiTheme="minorHAnsi" w:hAnsiTheme="minorHAnsi" w:cstheme="minorHAnsi"/>
+                <w:color w:val="auto"/>
+                <w:sz w:val="20"/>
+                <w:szCs w:val="18"/>
+              </w:rPr>
+              <w:t xml:space="preserve"> Yes</w:t>
             </w:r>
           </w:p>
         </w:tc>
@@ -2660,7 +2625,7 @@
               <w:pStyle w:val="p1"/>
               <w:jc w:val="center"/>
               <w:rPr>
-                <w:rFonts w:ascii="Century Gothic" w:hAnsi="Century Gothic"/>
+                <w:rFonts w:asciiTheme="minorHAnsi" w:hAnsiTheme="minorHAnsi" w:cstheme="minorHAnsi"/>
                 <w:color w:val="auto"/>
                 <w:sz w:val="20"/>
                 <w:szCs w:val="18"/>
@@ -2669,7 +2634,7 @@
             <w:sdt>
               <w:sdtPr>
                 <w:rPr>
-                  <w:rFonts w:ascii="Century Gothic" w:hAnsi="Century Gothic"/>
+                  <w:rFonts w:asciiTheme="minorHAnsi" w:hAnsiTheme="minorHAnsi" w:cstheme="minorHAnsi"/>
                   <w:color w:val="auto"/>
                   <w:sz w:val="20"/>
                   <w:szCs w:val="18"/>
@@ -2684,7 +2649,7 @@
               <w:sdtContent>
                 <w:r>
                   <w:rPr>
-                    <w:rFonts w:ascii="MS Gothic" w:eastAsia="MS Gothic" w:hAnsi="MS Gothic" w:hint="eastAsia"/>
+                    <w:rFonts w:ascii="Segoe UI Symbol" w:eastAsia="MS Gothic" w:hAnsi="Segoe UI Symbol" w:cs="Segoe UI Symbol"/>
                     <w:color w:val="auto"/>
                     <w:sz w:val="20"/>
                     <w:szCs w:val="18"/>
@@ -2695,21 +2660,12 @@
             </w:sdt>
             <w:r>
               <w:rPr>
-                <w:rFonts w:ascii="Century Gothic" w:hAnsi="Century Gothic"/>
-                <w:color w:val="auto"/>
-                <w:sz w:val="20"/>
-                <w:szCs w:val="18"/>
-              </w:rPr>
-              <w:t xml:space="preserve"> </w:t>
-            </w:r>
-            <w:r>
-              <w:rPr>
-                <w:rFonts w:ascii="Century Gothic" w:hAnsi="Century Gothic"/>
-                <w:color w:val="auto"/>
-                <w:sz w:val="20"/>
-                <w:szCs w:val="18"/>
-              </w:rPr>
-              <w:t>No</w:t>
+                <w:rFonts w:asciiTheme="minorHAnsi" w:hAnsiTheme="minorHAnsi" w:cstheme="minorHAnsi"/>
+                <w:color w:val="auto"/>
+                <w:sz w:val="20"/>
+                <w:szCs w:val="18"/>
+              </w:rPr>
+              <w:t xml:space="preserve"> No</w:t>
             </w:r>
           </w:p>
         </w:tc>
@@ -2724,7 +2680,7 @@
               <w:pStyle w:val="p1"/>
               <w:jc w:val="center"/>
               <w:rPr>
-                <w:rFonts w:ascii="Century Gothic" w:hAnsi="Century Gothic"/>
+                <w:rFonts w:asciiTheme="minorHAnsi" w:hAnsiTheme="minorHAnsi" w:cstheme="minorHAnsi"/>
                 <w:color w:val="auto"/>
                 <w:sz w:val="20"/>
                 <w:szCs w:val="18"/>
@@ -2750,7 +2706,7 @@
             <w:pPr>
               <w:pStyle w:val="p1"/>
               <w:rPr>
-                <w:rFonts w:ascii="Century Gothic" w:hAnsi="Century Gothic"/>
+                <w:rFonts w:asciiTheme="minorHAnsi" w:hAnsiTheme="minorHAnsi" w:cstheme="minorHAnsi"/>
                 <w:b/>
                 <w:bCs/>
                 <w:color w:val="3B3838" w:themeColor="background2" w:themeShade="40"/>
@@ -2759,7 +2715,7 @@
             </w:pPr>
             <w:r>
               <w:rPr>
-                <w:rFonts w:ascii="Century Gothic" w:hAnsi="Century Gothic"/>
+                <w:rFonts w:asciiTheme="minorHAnsi" w:hAnsiTheme="minorHAnsi" w:cstheme="minorHAnsi"/>
                 <w:b/>
                 <w:bCs/>
                 <w:color w:val="3B3838" w:themeColor="background2" w:themeShade="40"/>
@@ -2769,7 +2725,7 @@
             </w:r>
             <w:r>
               <w:rPr>
-                <w:rFonts w:ascii="Century Gothic" w:hAnsi="Century Gothic"/>
+                <w:rFonts w:asciiTheme="minorHAnsi" w:hAnsiTheme="minorHAnsi" w:cstheme="minorHAnsi"/>
                 <w:b/>
                 <w:bCs/>
                 <w:color w:val="3B3838" w:themeColor="background2" w:themeShade="40"/>
@@ -2801,15 +2757,15 @@
             <w:pPr>
               <w:pStyle w:val="p1"/>
               <w:rPr>
-                <w:rFonts w:ascii="Century Gothic" w:hAnsi="Century Gothic"/>
-                <w:color w:val="auto"/>
-                <w:sz w:val="20"/>
-                <w:szCs w:val="18"/>
-              </w:rPr>
-            </w:pPr>
-            <w:r>
-              <w:rPr>
-                <w:rFonts w:ascii="Century Gothic" w:hAnsi="Century Gothic"/>
+                <w:rFonts w:asciiTheme="minorHAnsi" w:hAnsiTheme="minorHAnsi" w:cstheme="minorHAnsi"/>
+                <w:color w:val="auto"/>
+                <w:sz w:val="20"/>
+                <w:szCs w:val="18"/>
+              </w:rPr>
+            </w:pPr>
+            <w:r>
+              <w:rPr>
+                <w:rFonts w:asciiTheme="minorHAnsi" w:hAnsiTheme="minorHAnsi" w:cstheme="minorHAnsi"/>
                 <w:color w:val="auto"/>
                 <w:sz w:val="20"/>
                 <w:szCs w:val="18"/>
@@ -2823,6 +2779,9 @@
     <w:p>
       <w:pPr>
         <w:spacing w:after="0"/>
+        <w:rPr>
+          <w:rFonts w:cstheme="minorHAnsi"/>
+        </w:rPr>
       </w:pPr>
     </w:p>
     <w:tbl>
@@ -2865,15 +2824,15 @@
               <w:pStyle w:val="p1"/>
               <w:jc w:val="center"/>
               <w:rPr>
-                <w:rFonts w:ascii="Century Gothic" w:hAnsi="Century Gothic"/>
-                <w:b/>
-                <w:bCs/>
-                <w:color w:val="auto"/>
-              </w:rPr>
-            </w:pPr>
-            <w:r>
-              <w:rPr>
-                <w:rFonts w:ascii="Century Gothic" w:hAnsi="Century Gothic"/>
+                <w:rFonts w:asciiTheme="minorHAnsi" w:hAnsiTheme="minorHAnsi" w:cstheme="minorHAnsi"/>
+                <w:b/>
+                <w:bCs/>
+                <w:color w:val="auto"/>
+              </w:rPr>
+            </w:pPr>
+            <w:r>
+              <w:rPr>
+                <w:rFonts w:asciiTheme="minorHAnsi" w:hAnsiTheme="minorHAnsi" w:cstheme="minorHAnsi"/>
                 <w:b/>
                 <w:bCs/>
                 <w:color w:val="auto"/>
@@ -2900,27 +2859,40 @@
             <w:pPr>
               <w:pStyle w:val="p1"/>
               <w:rPr>
-                <w:rFonts w:ascii="Century Gothic" w:hAnsi="Century Gothic"/>
+                <w:rFonts w:asciiTheme="minorHAnsi" w:hAnsiTheme="minorHAnsi" w:cstheme="minorHAnsi"/>
                 <w:b/>
                 <w:bCs/>
                 <w:color w:val="3B3838" w:themeColor="background2" w:themeShade="40"/>
                 <w:sz w:val="20"/>
               </w:rPr>
             </w:pPr>
-            <w:r>
-              <w:rPr>
-                <w:rFonts w:ascii="Century Gothic" w:hAnsi="Century Gothic"/>
+            <w:proofErr w:type="gramStart"/>
+            <w:r>
+              <w:rPr>
+                <w:rFonts w:asciiTheme="minorHAnsi" w:hAnsiTheme="minorHAnsi" w:cstheme="minorHAnsi"/>
                 <w:b/>
                 <w:bCs/>
                 <w:color w:val="3B3838" w:themeColor="background2" w:themeShade="40"/>
                 <w:sz w:val="20"/>
                 <w:szCs w:val="20"/>
               </w:rPr>
-              <w:t>List any systems, devices, or applications affected by the incident</w:t>
-            </w:r>
-            <w:r>
-              <w:rPr>
-                <w:rFonts w:ascii="Century Gothic" w:hAnsi="Century Gothic"/>
+              <w:t>List</w:t>
+            </w:r>
+            <w:proofErr w:type="gramEnd"/>
+            <w:r>
+              <w:rPr>
+                <w:rFonts w:asciiTheme="minorHAnsi" w:hAnsiTheme="minorHAnsi" w:cstheme="minorHAnsi"/>
+                <w:b/>
+                <w:bCs/>
+                <w:color w:val="3B3838" w:themeColor="background2" w:themeShade="40"/>
+                <w:sz w:val="20"/>
+                <w:szCs w:val="20"/>
+              </w:rPr>
+              <w:t xml:space="preserve"> any systems, devices, or applications affected by the incident</w:t>
+            </w:r>
+            <w:r>
+              <w:rPr>
+                <w:rFonts w:asciiTheme="minorHAnsi" w:hAnsiTheme="minorHAnsi" w:cstheme="minorHAnsi"/>
                 <w:b/>
                 <w:bCs/>
                 <w:color w:val="3B3838" w:themeColor="background2" w:themeShade="40"/>
@@ -2953,15 +2925,15 @@
             <w:pPr>
               <w:pStyle w:val="p1"/>
               <w:rPr>
-                <w:rFonts w:ascii="Century Gothic" w:hAnsi="Century Gothic"/>
-                <w:color w:val="auto"/>
-                <w:sz w:val="20"/>
-                <w:szCs w:val="18"/>
-              </w:rPr>
-            </w:pPr>
-            <w:r>
-              <w:rPr>
-                <w:rFonts w:ascii="Century Gothic" w:hAnsi="Century Gothic"/>
+                <w:rFonts w:asciiTheme="minorHAnsi" w:hAnsiTheme="minorHAnsi" w:cstheme="minorHAnsi"/>
+                <w:color w:val="auto"/>
+                <w:sz w:val="20"/>
+                <w:szCs w:val="18"/>
+              </w:rPr>
+            </w:pPr>
+            <w:r>
+              <w:rPr>
+                <w:rFonts w:asciiTheme="minorHAnsi" w:hAnsiTheme="minorHAnsi" w:cstheme="minorHAnsi"/>
                 <w:color w:val="auto"/>
                 <w:sz w:val="20"/>
                 <w:szCs w:val="18"/>
@@ -2988,7 +2960,7 @@
             <w:pPr>
               <w:pStyle w:val="p1"/>
               <w:rPr>
-                <w:rFonts w:ascii="Century Gothic" w:hAnsi="Century Gothic"/>
+                <w:rFonts w:asciiTheme="minorHAnsi" w:hAnsiTheme="minorHAnsi" w:cstheme="minorHAnsi"/>
                 <w:b/>
                 <w:bCs/>
                 <w:color w:val="3B3838" w:themeColor="background2" w:themeShade="40"/>
@@ -2997,7 +2969,7 @@
             </w:pPr>
             <w:r>
               <w:rPr>
-                <w:rFonts w:ascii="Century Gothic" w:hAnsi="Century Gothic"/>
+                <w:rFonts w:asciiTheme="minorHAnsi" w:hAnsiTheme="minorHAnsi" w:cstheme="minorHAnsi"/>
                 <w:b/>
                 <w:bCs/>
                 <w:color w:val="3B3838" w:themeColor="background2" w:themeShade="40"/>
@@ -3008,7 +2980,7 @@
             </w:r>
             <w:r>
               <w:rPr>
-                <w:rFonts w:ascii="Century Gothic" w:hAnsi="Century Gothic"/>
+                <w:rFonts w:asciiTheme="minorHAnsi" w:hAnsiTheme="minorHAnsi" w:cstheme="minorHAnsi"/>
                 <w:b/>
                 <w:bCs/>
                 <w:color w:val="3B3838" w:themeColor="background2" w:themeShade="40"/>
@@ -3038,15 +3010,15 @@
             <w:pPr>
               <w:pStyle w:val="p1"/>
               <w:rPr>
-                <w:rFonts w:ascii="Century Gothic" w:hAnsi="Century Gothic"/>
-                <w:color w:val="auto"/>
-                <w:sz w:val="20"/>
-                <w:szCs w:val="18"/>
-              </w:rPr>
-            </w:pPr>
-            <w:r>
-              <w:rPr>
-                <w:rFonts w:ascii="Century Gothic" w:hAnsi="Century Gothic"/>
+                <w:rFonts w:asciiTheme="minorHAnsi" w:hAnsiTheme="minorHAnsi" w:cstheme="minorHAnsi"/>
+                <w:color w:val="auto"/>
+                <w:sz w:val="20"/>
+                <w:szCs w:val="18"/>
+              </w:rPr>
+            </w:pPr>
+            <w:r>
+              <w:rPr>
+                <w:rFonts w:asciiTheme="minorHAnsi" w:hAnsiTheme="minorHAnsi" w:cstheme="minorHAnsi"/>
                 <w:color w:val="auto"/>
                 <w:sz w:val="20"/>
                 <w:szCs w:val="18"/>
@@ -3073,7 +3045,7 @@
             <w:pPr>
               <w:pStyle w:val="p1"/>
               <w:rPr>
-                <w:rFonts w:ascii="Century Gothic" w:hAnsi="Century Gothic"/>
+                <w:rFonts w:asciiTheme="minorHAnsi" w:hAnsiTheme="minorHAnsi" w:cstheme="minorHAnsi"/>
                 <w:b/>
                 <w:bCs/>
                 <w:color w:val="3B3838" w:themeColor="background2" w:themeShade="40"/>
@@ -3082,7 +3054,7 @@
             </w:pPr>
             <w:r>
               <w:rPr>
-                <w:rFonts w:ascii="Century Gothic" w:hAnsi="Century Gothic"/>
+                <w:rFonts w:asciiTheme="minorHAnsi" w:hAnsiTheme="minorHAnsi" w:cstheme="minorHAnsi"/>
                 <w:b/>
                 <w:bCs/>
                 <w:color w:val="3B3838" w:themeColor="background2" w:themeShade="40"/>
@@ -3093,7 +3065,7 @@
             </w:r>
             <w:r>
               <w:rPr>
-                <w:rFonts w:ascii="Century Gothic" w:hAnsi="Century Gothic"/>
+                <w:rFonts w:asciiTheme="minorHAnsi" w:hAnsiTheme="minorHAnsi" w:cstheme="minorHAnsi"/>
                 <w:b/>
                 <w:bCs/>
                 <w:color w:val="3B3838" w:themeColor="background2" w:themeShade="40"/>
@@ -3104,7 +3076,7 @@
             </w:r>
             <w:r>
               <w:rPr>
-                <w:rFonts w:ascii="Century Gothic" w:hAnsi="Century Gothic"/>
+                <w:rFonts w:asciiTheme="minorHAnsi" w:hAnsiTheme="minorHAnsi" w:cstheme="minorHAnsi"/>
                 <w:b/>
                 <w:bCs/>
                 <w:color w:val="3B3838" w:themeColor="background2" w:themeShade="40"/>
@@ -3115,7 +3087,7 @@
             </w:r>
             <w:r>
               <w:rPr>
-                <w:rFonts w:ascii="Century Gothic" w:hAnsi="Century Gothic"/>
+                <w:rFonts w:asciiTheme="minorHAnsi" w:hAnsiTheme="minorHAnsi" w:cstheme="minorHAnsi"/>
                 <w:b/>
                 <w:bCs/>
                 <w:color w:val="3B3838" w:themeColor="background2" w:themeShade="40"/>
@@ -3138,7 +3110,7 @@
             <w:pPr>
               <w:pStyle w:val="p1"/>
               <w:rPr>
-                <w:rFonts w:ascii="Century Gothic" w:hAnsi="Century Gothic"/>
+                <w:rFonts w:asciiTheme="minorHAnsi" w:hAnsiTheme="minorHAnsi" w:cstheme="minorHAnsi"/>
                 <w:b/>
                 <w:bCs/>
                 <w:color w:val="3B3838" w:themeColor="background2" w:themeShade="40"/>
@@ -3162,7 +3134,7 @@
               <w:pStyle w:val="p1"/>
               <w:jc w:val="center"/>
               <w:rPr>
-                <w:rFonts w:ascii="Century Gothic" w:hAnsi="Century Gothic"/>
+                <w:rFonts w:asciiTheme="minorHAnsi" w:hAnsiTheme="minorHAnsi" w:cstheme="minorHAnsi"/>
                 <w:color w:val="auto"/>
                 <w:sz w:val="20"/>
                 <w:szCs w:val="18"/>
@@ -3171,7 +3143,7 @@
             <w:sdt>
               <w:sdtPr>
                 <w:rPr>
-                  <w:rFonts w:ascii="Century Gothic" w:hAnsi="Century Gothic"/>
+                  <w:rFonts w:asciiTheme="minorHAnsi" w:hAnsiTheme="minorHAnsi" w:cstheme="minorHAnsi"/>
                   <w:color w:val="auto"/>
                   <w:sz w:val="20"/>
                   <w:szCs w:val="18"/>
@@ -3186,7 +3158,7 @@
               <w:sdtContent>
                 <w:r>
                   <w:rPr>
-                    <w:rFonts w:ascii="MS Gothic" w:eastAsia="MS Gothic" w:hAnsi="MS Gothic" w:hint="eastAsia"/>
+                    <w:rFonts w:ascii="Segoe UI Symbol" w:eastAsia="MS Gothic" w:hAnsi="Segoe UI Symbol" w:cs="Segoe UI Symbol"/>
                     <w:color w:val="auto"/>
                     <w:sz w:val="20"/>
                     <w:szCs w:val="18"/>
@@ -3197,7 +3169,7 @@
             </w:sdt>
             <w:r>
               <w:rPr>
-                <w:rFonts w:ascii="Century Gothic" w:hAnsi="Century Gothic"/>
+                <w:rFonts w:asciiTheme="minorHAnsi" w:hAnsiTheme="minorHAnsi" w:cstheme="minorHAnsi"/>
                 <w:color w:val="auto"/>
                 <w:sz w:val="20"/>
                 <w:szCs w:val="18"/>
@@ -3206,7 +3178,7 @@
             </w:r>
             <w:r>
               <w:rPr>
-                <w:rFonts w:ascii="Century Gothic" w:hAnsi="Century Gothic"/>
+                <w:rFonts w:asciiTheme="minorHAnsi" w:hAnsiTheme="minorHAnsi" w:cstheme="minorHAnsi"/>
                 <w:color w:val="auto"/>
                 <w:sz w:val="20"/>
                 <w:szCs w:val="18"/>
@@ -3225,7 +3197,7 @@
               <w:pStyle w:val="p1"/>
               <w:jc w:val="center"/>
               <w:rPr>
-                <w:rFonts w:ascii="Century Gothic" w:hAnsi="Century Gothic"/>
+                <w:rFonts w:asciiTheme="minorHAnsi" w:hAnsiTheme="minorHAnsi" w:cstheme="minorHAnsi"/>
                 <w:color w:val="auto"/>
                 <w:sz w:val="20"/>
                 <w:szCs w:val="18"/>
@@ -3234,7 +3206,7 @@
             <w:sdt>
               <w:sdtPr>
                 <w:rPr>
-                  <w:rFonts w:ascii="Century Gothic" w:hAnsi="Century Gothic"/>
+                  <w:rFonts w:asciiTheme="minorHAnsi" w:hAnsiTheme="minorHAnsi" w:cstheme="minorHAnsi"/>
                   <w:color w:val="auto"/>
                   <w:sz w:val="20"/>
                   <w:szCs w:val="18"/>
@@ -3249,7 +3221,7 @@
               <w:sdtContent>
                 <w:r>
                   <w:rPr>
-                    <w:rFonts w:ascii="MS Gothic" w:eastAsia="MS Gothic" w:hAnsi="MS Gothic" w:hint="eastAsia"/>
+                    <w:rFonts w:ascii="Segoe UI Symbol" w:eastAsia="MS Gothic" w:hAnsi="Segoe UI Symbol" w:cs="Segoe UI Symbol"/>
                     <w:color w:val="auto"/>
                     <w:sz w:val="20"/>
                     <w:szCs w:val="18"/>
@@ -3260,7 +3232,7 @@
             </w:sdt>
             <w:r>
               <w:rPr>
-                <w:rFonts w:ascii="Century Gothic" w:hAnsi="Century Gothic"/>
+                <w:rFonts w:asciiTheme="minorHAnsi" w:hAnsiTheme="minorHAnsi" w:cstheme="minorHAnsi"/>
                 <w:color w:val="auto"/>
                 <w:sz w:val="20"/>
                 <w:szCs w:val="18"/>
@@ -3269,7 +3241,7 @@
             </w:r>
             <w:r>
               <w:rPr>
-                <w:rFonts w:ascii="Century Gothic" w:hAnsi="Century Gothic"/>
+                <w:rFonts w:asciiTheme="minorHAnsi" w:hAnsiTheme="minorHAnsi" w:cstheme="minorHAnsi"/>
                 <w:color w:val="auto"/>
                 <w:sz w:val="20"/>
                 <w:szCs w:val="18"/>
@@ -3289,7 +3261,7 @@
               <w:pStyle w:val="p1"/>
               <w:jc w:val="center"/>
               <w:rPr>
-                <w:rFonts w:ascii="Century Gothic" w:hAnsi="Century Gothic"/>
+                <w:rFonts w:asciiTheme="minorHAnsi" w:hAnsiTheme="minorHAnsi" w:cstheme="minorHAnsi"/>
                 <w:color w:val="auto"/>
                 <w:sz w:val="20"/>
                 <w:szCs w:val="18"/>
@@ -3315,7 +3287,7 @@
             <w:pPr>
               <w:pStyle w:val="p1"/>
               <w:rPr>
-                <w:rFonts w:ascii="Century Gothic" w:hAnsi="Century Gothic"/>
+                <w:rFonts w:asciiTheme="minorHAnsi" w:hAnsiTheme="minorHAnsi" w:cstheme="minorHAnsi"/>
                 <w:b/>
                 <w:bCs/>
                 <w:color w:val="3B3838" w:themeColor="background2" w:themeShade="40"/>
@@ -3324,7 +3296,7 @@
             </w:pPr>
             <w:r>
               <w:rPr>
-                <w:rFonts w:ascii="Century Gothic" w:hAnsi="Century Gothic"/>
+                <w:rFonts w:asciiTheme="minorHAnsi" w:hAnsiTheme="minorHAnsi" w:cstheme="minorHAnsi"/>
                 <w:b/>
                 <w:bCs/>
                 <w:color w:val="3B3838" w:themeColor="background2" w:themeShade="40"/>
@@ -3334,7 +3306,7 @@
             </w:r>
             <w:r>
               <w:rPr>
-                <w:rFonts w:ascii="Century Gothic" w:hAnsi="Century Gothic"/>
+                <w:rFonts w:asciiTheme="minorHAnsi" w:hAnsiTheme="minorHAnsi" w:cstheme="minorHAnsi"/>
                 <w:b/>
                 <w:bCs/>
                 <w:color w:val="3B3838" w:themeColor="background2" w:themeShade="40"/>
@@ -3344,7 +3316,7 @@
             </w:r>
             <w:r>
               <w:rPr>
-                <w:rFonts w:ascii="Century Gothic" w:hAnsi="Century Gothic"/>
+                <w:rFonts w:asciiTheme="minorHAnsi" w:hAnsiTheme="minorHAnsi" w:cstheme="minorHAnsi"/>
                 <w:b/>
                 <w:bCs/>
                 <w:color w:val="3B3838" w:themeColor="background2" w:themeShade="40"/>
@@ -3354,7 +3326,7 @@
             </w:r>
             <w:r>
               <w:rPr>
-                <w:rFonts w:ascii="Century Gothic" w:hAnsi="Century Gothic"/>
+                <w:rFonts w:asciiTheme="minorHAnsi" w:hAnsiTheme="minorHAnsi" w:cstheme="minorHAnsi"/>
                 <w:b/>
                 <w:bCs/>
                 <w:color w:val="3B3838" w:themeColor="background2" w:themeShade="40"/>
@@ -3386,20 +3358,60 @@
             <w:pPr>
               <w:pStyle w:val="p1"/>
               <w:rPr>
-                <w:rFonts w:ascii="Century Gothic" w:hAnsi="Century Gothic"/>
-                <w:color w:val="auto"/>
-                <w:sz w:val="20"/>
-                <w:szCs w:val="18"/>
-              </w:rPr>
-            </w:pPr>
-            <w:r>
-              <w:rPr>
-                <w:rFonts w:ascii="Century Gothic" w:hAnsi="Century Gothic"/>
-                <w:color w:val="auto"/>
-                <w:sz w:val="20"/>
-                <w:szCs w:val="18"/>
-              </w:rPr>
-              <w:t>The installation of a ToolShell webshell running under IIS application pool privileges provides the attacker with full access to the SharePoint database, site contents, and local system files, making data exposure highly probable.</w:t>
+                <w:rFonts w:asciiTheme="minorHAnsi" w:hAnsiTheme="minorHAnsi" w:cstheme="minorHAnsi"/>
+                <w:color w:val="auto"/>
+                <w:sz w:val="20"/>
+                <w:szCs w:val="18"/>
+              </w:rPr>
+            </w:pPr>
+            <w:r>
+              <w:rPr>
+                <w:rFonts w:asciiTheme="minorHAnsi" w:hAnsiTheme="minorHAnsi" w:cstheme="minorHAnsi"/>
+                <w:color w:val="auto"/>
+                <w:sz w:val="20"/>
+                <w:szCs w:val="18"/>
+              </w:rPr>
+              <w:t xml:space="preserve">The installation of a </w:t>
+            </w:r>
+            <w:proofErr w:type="spellStart"/>
+            <w:r>
+              <w:rPr>
+                <w:rFonts w:asciiTheme="minorHAnsi" w:hAnsiTheme="minorHAnsi" w:cstheme="minorHAnsi"/>
+                <w:color w:val="auto"/>
+                <w:sz w:val="20"/>
+                <w:szCs w:val="18"/>
+              </w:rPr>
+              <w:t>ToolShell</w:t>
+            </w:r>
+            <w:proofErr w:type="spellEnd"/>
+            <w:r>
+              <w:rPr>
+                <w:rFonts w:asciiTheme="minorHAnsi" w:hAnsiTheme="minorHAnsi" w:cstheme="minorHAnsi"/>
+                <w:color w:val="auto"/>
+                <w:sz w:val="20"/>
+                <w:szCs w:val="18"/>
+              </w:rPr>
+              <w:t xml:space="preserve"> </w:t>
+            </w:r>
+            <w:proofErr w:type="spellStart"/>
+            <w:r>
+              <w:rPr>
+                <w:rFonts w:asciiTheme="minorHAnsi" w:hAnsiTheme="minorHAnsi" w:cstheme="minorHAnsi"/>
+                <w:color w:val="auto"/>
+                <w:sz w:val="20"/>
+                <w:szCs w:val="18"/>
+              </w:rPr>
+              <w:t>webshell</w:t>
+            </w:r>
+            <w:proofErr w:type="spellEnd"/>
+            <w:r>
+              <w:rPr>
+                <w:rFonts w:asciiTheme="minorHAnsi" w:hAnsiTheme="minorHAnsi" w:cstheme="minorHAnsi"/>
+                <w:color w:val="auto"/>
+                <w:sz w:val="20"/>
+                <w:szCs w:val="18"/>
+              </w:rPr>
+              <w:t xml:space="preserve"> running under IIS application pool privileges provides the attacker with full access to the SharePoint database, site contents, and local system files, making data exposure highly probable.</w:t>
             </w:r>
           </w:p>
         </w:tc>
@@ -3409,7 +3421,7 @@
       <w:pPr>
         <w:spacing w:after="0"/>
         <w:rPr>
-          <w:rFonts w:ascii="Century Gothic" w:hAnsi="Century Gothic"/>
+          <w:rFonts w:cstheme="minorHAnsi"/>
         </w:rPr>
       </w:pPr>
     </w:p>
@@ -3449,15 +3461,15 @@
               <w:pStyle w:val="p1"/>
               <w:jc w:val="center"/>
               <w:rPr>
-                <w:rFonts w:ascii="Century Gothic" w:hAnsi="Century Gothic"/>
-                <w:b/>
-                <w:bCs/>
-                <w:color w:val="auto"/>
-              </w:rPr>
-            </w:pPr>
-            <w:r>
-              <w:rPr>
-                <w:rFonts w:ascii="Century Gothic" w:hAnsi="Century Gothic"/>
+                <w:rFonts w:asciiTheme="minorHAnsi" w:hAnsiTheme="minorHAnsi" w:cstheme="minorHAnsi"/>
+                <w:b/>
+                <w:bCs/>
+                <w:color w:val="auto"/>
+              </w:rPr>
+            </w:pPr>
+            <w:r>
+              <w:rPr>
+                <w:rFonts w:asciiTheme="minorHAnsi" w:hAnsiTheme="minorHAnsi" w:cstheme="minorHAnsi"/>
                 <w:b/>
                 <w:bCs/>
                 <w:color w:val="auto"/>
@@ -3466,7 +3478,7 @@
             </w:r>
             <w:r>
               <w:rPr>
-                <w:rFonts w:ascii="Century Gothic" w:hAnsi="Century Gothic"/>
+                <w:rFonts w:asciiTheme="minorHAnsi" w:hAnsiTheme="minorHAnsi" w:cstheme="minorHAnsi"/>
                 <w:i/>
                 <w:iCs/>
                 <w:color w:val="auto"/>
@@ -3475,7 +3487,7 @@
             </w:r>
             <w:r>
               <w:rPr>
-                <w:rFonts w:ascii="Century Gothic" w:hAnsi="Century Gothic"/>
+                <w:rFonts w:asciiTheme="minorHAnsi" w:hAnsiTheme="minorHAnsi" w:cstheme="minorHAnsi"/>
                 <w:i/>
                 <w:iCs/>
                 <w:color w:val="auto"/>
@@ -3501,7 +3513,7 @@
             <w:pPr>
               <w:pStyle w:val="p1"/>
               <w:rPr>
-                <w:rFonts w:ascii="Century Gothic" w:hAnsi="Century Gothic"/>
+                <w:rFonts w:asciiTheme="minorHAnsi" w:hAnsiTheme="minorHAnsi" w:cstheme="minorHAnsi"/>
                 <w:b/>
                 <w:bCs/>
                 <w:color w:val="3B3838" w:themeColor="background2" w:themeShade="40"/>
@@ -3510,7 +3522,7 @@
             </w:pPr>
             <w:r>
               <w:rPr>
-                <w:rFonts w:ascii="Century Gothic" w:hAnsi="Century Gothic"/>
+                <w:rFonts w:asciiTheme="minorHAnsi" w:hAnsiTheme="minorHAnsi" w:cstheme="minorHAnsi"/>
                 <w:b/>
                 <w:bCs/>
                 <w:color w:val="3B3838" w:themeColor="background2" w:themeShade="40"/>
@@ -3521,7 +3533,7 @@
             </w:r>
             <w:r>
               <w:rPr>
-                <w:rFonts w:ascii="Century Gothic" w:hAnsi="Century Gothic"/>
+                <w:rFonts w:asciiTheme="minorHAnsi" w:hAnsiTheme="minorHAnsi" w:cstheme="minorHAnsi"/>
                 <w:b/>
                 <w:bCs/>
                 <w:color w:val="3B3838" w:themeColor="background2" w:themeShade="40"/>
@@ -3550,51 +3562,41 @@
           <w:p>
             <w:pPr>
               <w:pStyle w:val="p1"/>
-              <w:rPr>
-                <w:rFonts w:ascii="Century Gothic" w:hAnsi="Century Gothic"/>
-                <w:sz w:val="20"/>
-                <w:szCs w:val="18"/>
-              </w:rPr>
-            </w:pPr>
-            <w:r>
-              <w:rPr>
-                <w:rFonts w:ascii="Century Gothic" w:hAnsi="Century Gothic"/>
-                <w:sz w:val="20"/>
-                <w:szCs w:val="18"/>
-              </w:rPr>
-              <w:t xml:space="preserve">  </w:t>
-            </w:r>
-            <w:r>
-              <w:rPr>
-                <w:rFonts w:ascii="Century Gothic" w:hAnsi="Century Gothic"/>
-                <w:b/>
-                <w:bCs/>
-                <w:sz w:val="20"/>
-                <w:szCs w:val="18"/>
-              </w:rPr>
-              <w:t>Suspected cause or entry point (e.g., phishing email, unpatched software):</w:t>
-            </w:r>
-          </w:p>
-          <w:p>
-            <w:pPr>
-              <w:pStyle w:val="p1"/>
               <w:numPr>
                 <w:ilvl w:val="0"/>
                 <w:numId w:val="8"/>
               </w:numPr>
               <w:rPr>
-                <w:rFonts w:ascii="Century Gothic" w:hAnsi="Century Gothic"/>
-                <w:sz w:val="20"/>
-                <w:szCs w:val="18"/>
-              </w:rPr>
-            </w:pPr>
-            <w:r>
-              <w:rPr>
-                <w:rFonts w:ascii="Century Gothic" w:hAnsi="Century Gothic"/>
-                <w:sz w:val="20"/>
-                <w:szCs w:val="18"/>
-              </w:rPr>
-              <w:t>Exploitation of a critical zero-day vulnerability (CVE-2025-53770) involving an authentication bypass and remote code execution flaw in the ToolShell component of on-premises SharePoint Server deployments.</w:t>
+                <w:rFonts w:asciiTheme="minorHAnsi" w:hAnsiTheme="minorHAnsi" w:cstheme="minorHAnsi"/>
+                <w:sz w:val="20"/>
+                <w:szCs w:val="18"/>
+              </w:rPr>
+            </w:pPr>
+            <w:r>
+              <w:rPr>
+                <w:rFonts w:asciiTheme="minorHAnsi" w:hAnsiTheme="minorHAnsi" w:cstheme="minorHAnsi"/>
+                <w:sz w:val="20"/>
+                <w:szCs w:val="18"/>
+              </w:rPr>
+              <w:t xml:space="preserve">Exploitation of a critical zero-day vulnerability (CVE-2025-53770) involving an authentication bypass and remote code execution flaw in the </w:t>
+            </w:r>
+            <w:proofErr w:type="spellStart"/>
+            <w:r>
+              <w:rPr>
+                <w:rFonts w:asciiTheme="minorHAnsi" w:hAnsiTheme="minorHAnsi" w:cstheme="minorHAnsi"/>
+                <w:sz w:val="20"/>
+                <w:szCs w:val="18"/>
+              </w:rPr>
+              <w:t>ToolShell</w:t>
+            </w:r>
+            <w:proofErr w:type="spellEnd"/>
+            <w:r>
+              <w:rPr>
+                <w:rFonts w:asciiTheme="minorHAnsi" w:hAnsiTheme="minorHAnsi" w:cstheme="minorHAnsi"/>
+                <w:sz w:val="20"/>
+                <w:szCs w:val="18"/>
+              </w:rPr>
+              <w:t xml:space="preserve"> component of on-premises SharePoint Server deployments.</w:t>
             </w:r>
           </w:p>
         </w:tc>
@@ -3616,7 +3618,7 @@
             <w:pPr>
               <w:pStyle w:val="p1"/>
               <w:rPr>
-                <w:rFonts w:ascii="Century Gothic" w:hAnsi="Century Gothic"/>
+                <w:rFonts w:asciiTheme="minorHAnsi" w:hAnsiTheme="minorHAnsi" w:cstheme="minorHAnsi"/>
                 <w:b/>
                 <w:bCs/>
                 <w:color w:val="3B3838" w:themeColor="background2" w:themeShade="40"/>
@@ -3625,7 +3627,7 @@
             </w:pPr>
             <w:r>
               <w:rPr>
-                <w:rFonts w:ascii="Century Gothic" w:hAnsi="Century Gothic"/>
+                <w:rFonts w:asciiTheme="minorHAnsi" w:hAnsiTheme="minorHAnsi" w:cstheme="minorHAnsi"/>
                 <w:b/>
                 <w:bCs/>
                 <w:color w:val="3B3838" w:themeColor="background2" w:themeShade="40"/>
@@ -3651,7 +3653,7 @@
               <w:pStyle w:val="p1"/>
               <w:jc w:val="center"/>
               <w:rPr>
-                <w:rFonts w:ascii="Century Gothic" w:hAnsi="Century Gothic"/>
+                <w:rFonts w:asciiTheme="minorHAnsi" w:hAnsiTheme="minorHAnsi" w:cstheme="minorHAnsi"/>
                 <w:color w:val="auto"/>
                 <w:sz w:val="20"/>
                 <w:szCs w:val="18"/>
@@ -3660,7 +3662,7 @@
             <w:sdt>
               <w:sdtPr>
                 <w:rPr>
-                  <w:rFonts w:ascii="Century Gothic" w:hAnsi="Century Gothic"/>
+                  <w:rFonts w:asciiTheme="minorHAnsi" w:hAnsiTheme="minorHAnsi" w:cstheme="minorHAnsi"/>
                   <w:color w:val="auto"/>
                   <w:sz w:val="20"/>
                   <w:szCs w:val="18"/>
@@ -3686,7 +3688,7 @@
             </w:sdt>
             <w:r>
               <w:rPr>
-                <w:rFonts w:ascii="Century Gothic" w:hAnsi="Century Gothic"/>
+                <w:rFonts w:asciiTheme="minorHAnsi" w:hAnsiTheme="minorHAnsi" w:cstheme="minorHAnsi"/>
                 <w:color w:val="auto"/>
                 <w:sz w:val="20"/>
                 <w:szCs w:val="18"/>
@@ -3695,7 +3697,7 @@
             </w:r>
             <w:r>
               <w:rPr>
-                <w:rFonts w:ascii="Century Gothic" w:hAnsi="Century Gothic"/>
+                <w:rFonts w:asciiTheme="minorHAnsi" w:hAnsiTheme="minorHAnsi" w:cstheme="minorHAnsi"/>
                 <w:color w:val="auto"/>
                 <w:sz w:val="20"/>
                 <w:szCs w:val="18"/>
@@ -3714,7 +3716,7 @@
               <w:pStyle w:val="p1"/>
               <w:jc w:val="center"/>
               <w:rPr>
-                <w:rFonts w:ascii="Century Gothic" w:hAnsi="Century Gothic"/>
+                <w:rFonts w:asciiTheme="minorHAnsi" w:hAnsiTheme="minorHAnsi" w:cstheme="minorHAnsi"/>
                 <w:color w:val="auto"/>
                 <w:sz w:val="20"/>
                 <w:szCs w:val="18"/>
@@ -3723,7 +3725,7 @@
             <w:sdt>
               <w:sdtPr>
                 <w:rPr>
-                  <w:rFonts w:ascii="Century Gothic" w:hAnsi="Century Gothic"/>
+                  <w:rFonts w:asciiTheme="minorHAnsi" w:hAnsiTheme="minorHAnsi" w:cstheme="minorHAnsi"/>
                   <w:color w:val="auto"/>
                   <w:sz w:val="20"/>
                   <w:szCs w:val="18"/>
@@ -3738,7 +3740,7 @@
               <w:sdtContent>
                 <w:r>
                   <w:rPr>
-                    <w:rFonts w:ascii="MS Gothic" w:eastAsia="MS Gothic" w:hAnsi="MS Gothic" w:hint="eastAsia"/>
+                    <w:rFonts w:ascii="Segoe UI Symbol" w:eastAsia="MS Gothic" w:hAnsi="Segoe UI Symbol" w:cs="Segoe UI Symbol"/>
                     <w:color w:val="auto"/>
                     <w:sz w:val="20"/>
                     <w:szCs w:val="18"/>
@@ -3749,7 +3751,7 @@
             </w:sdt>
             <w:r>
               <w:rPr>
-                <w:rFonts w:ascii="Century Gothic" w:hAnsi="Century Gothic"/>
+                <w:rFonts w:asciiTheme="minorHAnsi" w:hAnsiTheme="minorHAnsi" w:cstheme="minorHAnsi"/>
                 <w:color w:val="auto"/>
                 <w:sz w:val="20"/>
                 <w:szCs w:val="18"/>
@@ -3758,7 +3760,7 @@
             </w:r>
             <w:r>
               <w:rPr>
-                <w:rFonts w:ascii="Century Gothic" w:hAnsi="Century Gothic"/>
+                <w:rFonts w:asciiTheme="minorHAnsi" w:hAnsiTheme="minorHAnsi" w:cstheme="minorHAnsi"/>
                 <w:color w:val="auto"/>
                 <w:sz w:val="20"/>
                 <w:szCs w:val="18"/>
@@ -3777,7 +3779,7 @@
               <w:pStyle w:val="p1"/>
               <w:jc w:val="center"/>
               <w:rPr>
-                <w:rFonts w:ascii="Century Gothic" w:hAnsi="Century Gothic"/>
+                <w:rFonts w:asciiTheme="minorHAnsi" w:hAnsiTheme="minorHAnsi" w:cstheme="minorHAnsi"/>
                 <w:color w:val="auto"/>
                 <w:sz w:val="20"/>
                 <w:szCs w:val="18"/>
@@ -3786,7 +3788,7 @@
             <w:sdt>
               <w:sdtPr>
                 <w:rPr>
-                  <w:rFonts w:ascii="Century Gothic" w:hAnsi="Century Gothic"/>
+                  <w:rFonts w:asciiTheme="minorHAnsi" w:hAnsiTheme="minorHAnsi" w:cstheme="minorHAnsi"/>
                   <w:color w:val="auto"/>
                   <w:sz w:val="20"/>
                   <w:szCs w:val="18"/>
@@ -3812,7 +3814,7 @@
             </w:sdt>
             <w:r>
               <w:rPr>
-                <w:rFonts w:ascii="Century Gothic" w:hAnsi="Century Gothic"/>
+                <w:rFonts w:asciiTheme="minorHAnsi" w:hAnsiTheme="minorHAnsi" w:cstheme="minorHAnsi"/>
                 <w:color w:val="auto"/>
                 <w:sz w:val="20"/>
                 <w:szCs w:val="18"/>
@@ -3821,7 +3823,7 @@
             </w:r>
             <w:r>
               <w:rPr>
-                <w:rFonts w:ascii="Century Gothic" w:hAnsi="Century Gothic"/>
+                <w:rFonts w:asciiTheme="minorHAnsi" w:hAnsiTheme="minorHAnsi" w:cstheme="minorHAnsi"/>
                 <w:color w:val="auto"/>
                 <w:sz w:val="20"/>
                 <w:szCs w:val="18"/>
@@ -3836,7 +3838,7 @@
       <w:pPr>
         <w:spacing w:after="0"/>
         <w:rPr>
-          <w:rFonts w:ascii="Century Gothic" w:hAnsi="Century Gothic"/>
+          <w:rFonts w:cstheme="minorHAnsi"/>
         </w:rPr>
       </w:pPr>
     </w:p>
@@ -3844,7 +3846,7 @@
       <w:pPr>
         <w:spacing w:after="0"/>
         <w:rPr>
-          <w:rFonts w:ascii="Century Gothic" w:hAnsi="Century Gothic"/>
+          <w:rFonts w:cstheme="minorHAnsi"/>
         </w:rPr>
       </w:pPr>
     </w:p>
@@ -3852,7 +3854,7 @@
       <w:pPr>
         <w:pStyle w:val="p1"/>
         <w:rPr>
-          <w:rFonts w:ascii="Century Gothic" w:hAnsi="Century Gothic"/>
+          <w:rFonts w:asciiTheme="minorHAnsi" w:hAnsiTheme="minorHAnsi" w:cstheme="minorHAnsi"/>
           <w:b/>
           <w:bCs/>
           <w:color w:val="3B3838" w:themeColor="background2" w:themeShade="40"/>
@@ -3862,7 +3864,7 @@
       </w:pPr>
       <w:r>
         <w:rPr>
-          <w:rFonts w:ascii="Century Gothic" w:hAnsi="Century Gothic"/>
+          <w:rFonts w:asciiTheme="minorHAnsi" w:hAnsiTheme="minorHAnsi" w:cstheme="minorHAnsi"/>
           <w:b/>
           <w:bCs/>
           <w:color w:val="3B3838" w:themeColor="background2" w:themeShade="40"/>
@@ -3873,7 +3875,7 @@
       </w:r>
       <w:r>
         <w:rPr>
-          <w:rFonts w:ascii="Century Gothic" w:hAnsi="Century Gothic"/>
+          <w:rFonts w:asciiTheme="minorHAnsi" w:hAnsiTheme="minorHAnsi" w:cstheme="minorHAnsi"/>
           <w:b/>
           <w:bCs/>
           <w:color w:val="3B3838" w:themeColor="background2" w:themeShade="40"/>
@@ -3884,7 +3886,7 @@
       </w:r>
       <w:r>
         <w:rPr>
-          <w:rFonts w:ascii="Century Gothic" w:hAnsi="Century Gothic"/>
+          <w:rFonts w:asciiTheme="minorHAnsi" w:hAnsiTheme="minorHAnsi" w:cstheme="minorHAnsi"/>
           <w:b/>
           <w:bCs/>
           <w:color w:val="3B3838" w:themeColor="background2" w:themeShade="40"/>
@@ -3933,15 +3935,15 @@
             <w:pPr>
               <w:pStyle w:val="p1"/>
               <w:rPr>
-                <w:rFonts w:ascii="Century Gothic" w:hAnsi="Century Gothic"/>
-                <w:color w:val="auto"/>
-                <w:sz w:val="20"/>
-                <w:szCs w:val="18"/>
-              </w:rPr>
-            </w:pPr>
-            <w:r>
-              <w:rPr>
-                <w:rFonts w:ascii="Century Gothic" w:hAnsi="Century Gothic"/>
+                <w:rFonts w:asciiTheme="minorHAnsi" w:hAnsiTheme="minorHAnsi" w:cstheme="minorHAnsi"/>
+                <w:color w:val="auto"/>
+                <w:sz w:val="20"/>
+                <w:szCs w:val="18"/>
+              </w:rPr>
+            </w:pPr>
+            <w:r>
+              <w:rPr>
+                <w:rFonts w:asciiTheme="minorHAnsi" w:hAnsiTheme="minorHAnsi" w:cstheme="minorHAnsi"/>
                 <w:color w:val="auto"/>
                 <w:sz w:val="20"/>
                 <w:szCs w:val="18"/>
@@ -3959,7 +3961,7 @@
             <w:pPr>
               <w:pStyle w:val="p1"/>
               <w:rPr>
-                <w:rFonts w:ascii="Century Gothic" w:hAnsi="Century Gothic"/>
+                <w:rFonts w:asciiTheme="minorHAnsi" w:hAnsiTheme="minorHAnsi" w:cstheme="minorHAnsi"/>
                 <w:color w:val="auto"/>
                 <w:sz w:val="20"/>
                 <w:szCs w:val="18"/>
@@ -3979,15 +3981,15 @@
             <w:pPr>
               <w:pStyle w:val="p1"/>
               <w:rPr>
-                <w:rFonts w:ascii="Century Gothic" w:hAnsi="Century Gothic"/>
-                <w:color w:val="auto"/>
-                <w:sz w:val="20"/>
-                <w:szCs w:val="18"/>
-              </w:rPr>
-            </w:pPr>
-            <w:r>
-              <w:rPr>
-                <w:rFonts w:ascii="Century Gothic" w:hAnsi="Century Gothic"/>
+                <w:rFonts w:asciiTheme="minorHAnsi" w:hAnsiTheme="minorHAnsi" w:cstheme="minorHAnsi"/>
+                <w:color w:val="auto"/>
+                <w:sz w:val="20"/>
+                <w:szCs w:val="18"/>
+              </w:rPr>
+            </w:pPr>
+            <w:r>
+              <w:rPr>
+                <w:rFonts w:asciiTheme="minorHAnsi" w:hAnsiTheme="minorHAnsi" w:cstheme="minorHAnsi"/>
                 <w:color w:val="auto"/>
                 <w:sz w:val="20"/>
                 <w:szCs w:val="18"/>
@@ -4005,7 +4007,7 @@
             <w:pPr>
               <w:pStyle w:val="p1"/>
               <w:rPr>
-                <w:rFonts w:ascii="Century Gothic" w:hAnsi="Century Gothic"/>
+                <w:rFonts w:asciiTheme="minorHAnsi" w:hAnsiTheme="minorHAnsi" w:cstheme="minorHAnsi"/>
                 <w:color w:val="auto"/>
                 <w:sz w:val="20"/>
                 <w:szCs w:val="18"/>
@@ -4025,7 +4027,7 @@
             <w:pPr>
               <w:pStyle w:val="p1"/>
               <w:rPr>
-                <w:rFonts w:ascii="Century Gothic" w:hAnsi="Century Gothic"/>
+                <w:rFonts w:asciiTheme="minorHAnsi" w:hAnsiTheme="minorHAnsi" w:cstheme="minorHAnsi"/>
                 <w:color w:val="auto"/>
                 <w:sz w:val="20"/>
                 <w:szCs w:val="18"/>
@@ -4047,7 +4049,7 @@
             <w:pPr>
               <w:pStyle w:val="p1"/>
               <w:rPr>
-                <w:rFonts w:ascii="Century Gothic" w:hAnsi="Century Gothic"/>
+                <w:rFonts w:asciiTheme="minorHAnsi" w:hAnsiTheme="minorHAnsi" w:cstheme="minorHAnsi"/>
                 <w:b/>
                 <w:bCs/>
                 <w:color w:val="3B3838" w:themeColor="background2" w:themeShade="40"/>
@@ -4057,7 +4059,7 @@
             </w:pPr>
             <w:r>
               <w:rPr>
-                <w:rFonts w:ascii="Century Gothic" w:hAnsi="Century Gothic"/>
+                <w:rFonts w:asciiTheme="minorHAnsi" w:hAnsiTheme="minorHAnsi" w:cstheme="minorHAnsi"/>
                 <w:b/>
                 <w:bCs/>
                 <w:color w:val="3B3838" w:themeColor="background2" w:themeShade="40"/>
@@ -4077,7 +4079,7 @@
             <w:pPr>
               <w:pStyle w:val="p1"/>
               <w:rPr>
-                <w:rFonts w:ascii="Century Gothic" w:hAnsi="Century Gothic"/>
+                <w:rFonts w:asciiTheme="minorHAnsi" w:hAnsiTheme="minorHAnsi" w:cstheme="minorHAnsi"/>
                 <w:b/>
                 <w:bCs/>
                 <w:color w:val="3B3838" w:themeColor="background2" w:themeShade="40"/>
@@ -4096,7 +4098,7 @@
             <w:pPr>
               <w:pStyle w:val="p1"/>
               <w:rPr>
-                <w:rFonts w:ascii="Century Gothic" w:hAnsi="Century Gothic"/>
+                <w:rFonts w:asciiTheme="minorHAnsi" w:hAnsiTheme="minorHAnsi" w:cstheme="minorHAnsi"/>
                 <w:b/>
                 <w:bCs/>
                 <w:color w:val="3B3838" w:themeColor="background2" w:themeShade="40"/>
@@ -4106,7 +4108,7 @@
             </w:pPr>
             <w:r>
               <w:rPr>
-                <w:rFonts w:ascii="Century Gothic" w:hAnsi="Century Gothic"/>
+                <w:rFonts w:asciiTheme="minorHAnsi" w:hAnsiTheme="minorHAnsi" w:cstheme="minorHAnsi"/>
                 <w:b/>
                 <w:bCs/>
                 <w:color w:val="3B3838" w:themeColor="background2" w:themeShade="40"/>
@@ -4126,7 +4128,7 @@
             <w:pPr>
               <w:pStyle w:val="p1"/>
               <w:rPr>
-                <w:rFonts w:ascii="Century Gothic" w:hAnsi="Century Gothic"/>
+                <w:rFonts w:asciiTheme="minorHAnsi" w:hAnsiTheme="minorHAnsi" w:cstheme="minorHAnsi"/>
                 <w:b/>
                 <w:bCs/>
                 <w:color w:val="3B3838" w:themeColor="background2" w:themeShade="40"/>
@@ -4145,7 +4147,7 @@
             <w:pPr>
               <w:pStyle w:val="p1"/>
               <w:rPr>
-                <w:rFonts w:ascii="Century Gothic" w:hAnsi="Century Gothic"/>
+                <w:rFonts w:asciiTheme="minorHAnsi" w:hAnsiTheme="minorHAnsi" w:cstheme="minorHAnsi"/>
                 <w:b/>
                 <w:bCs/>
                 <w:color w:val="3B3838" w:themeColor="background2" w:themeShade="40"/>
@@ -4154,40 +4156,29 @@
             </w:pPr>
             <w:r>
               <w:rPr>
-                <w:rFonts w:ascii="Century Gothic" w:hAnsi="Century Gothic"/>
+                <w:rFonts w:asciiTheme="minorHAnsi" w:hAnsiTheme="minorHAnsi" w:cstheme="minorHAnsi"/>
                 <w:b/>
                 <w:bCs/>
                 <w:color w:val="3B3838" w:themeColor="background2" w:themeShade="40"/>
                 <w:sz w:val="20"/>
                 <w:szCs w:val="18"/>
               </w:rPr>
-              <w:t>Date</w:t>
-            </w:r>
-            <w:r>
-              <w:rPr>
-                <w:rFonts w:ascii="Century Gothic" w:hAnsi="Century Gothic"/>
+              <w:t xml:space="preserve">Date </w:t>
+            </w:r>
+            <w:r>
+              <w:rPr>
+                <w:rFonts w:asciiTheme="minorHAnsi" w:hAnsiTheme="minorHAnsi" w:cstheme="minorHAnsi"/>
                 <w:b/>
                 <w:bCs/>
                 <w:color w:val="3B3838" w:themeColor="background2" w:themeShade="40"/>
                 <w:sz w:val="20"/>
                 <w:szCs w:val="18"/>
               </w:rPr>
-              <w:t xml:space="preserve"> </w:t>
-            </w:r>
-            <w:r>
-              <w:rPr>
-                <w:rFonts w:ascii="Century Gothic" w:hAnsi="Century Gothic"/>
-                <w:b/>
-                <w:bCs/>
-                <w:color w:val="3B3838" w:themeColor="background2" w:themeShade="40"/>
-                <w:sz w:val="20"/>
-                <w:szCs w:val="18"/>
-              </w:rPr>
               <w:t>s</w:t>
             </w:r>
             <w:r>
               <w:rPr>
-                <w:rFonts w:ascii="Century Gothic" w:hAnsi="Century Gothic"/>
+                <w:rFonts w:asciiTheme="minorHAnsi" w:hAnsiTheme="minorHAnsi" w:cstheme="minorHAnsi"/>
                 <w:b/>
                 <w:bCs/>
                 <w:color w:val="3B3838" w:themeColor="background2" w:themeShade="40"/>
@@ -4201,7 +4192,15 @@
       </w:tr>
     </w:tbl>
     <w:p>
+      <w:pPr>
+        <w:rPr>
+          <w:rFonts w:cstheme="minorHAnsi"/>
+        </w:rPr>
+      </w:pPr>
       <w:r>
+        <w:rPr>
+          <w:rFonts w:cstheme="minorHAnsi"/>
+        </w:rPr>
         <w:br w:type="page"/>
       </w:r>
     </w:p>
@@ -4241,7 +4240,7 @@
             <w:pPr>
               <w:pStyle w:val="p1"/>
               <w:rPr>
-                <w:rFonts w:ascii="Century Gothic" w:hAnsi="Century Gothic"/>
+                <w:rFonts w:asciiTheme="minorHAnsi" w:hAnsiTheme="minorHAnsi" w:cstheme="minorHAnsi"/>
                 <w:b/>
                 <w:bCs/>
                 <w:color w:val="3B3838" w:themeColor="background2" w:themeShade="40"/>
@@ -4260,7 +4259,7 @@
             <w:pPr>
               <w:pStyle w:val="p1"/>
               <w:rPr>
-                <w:rFonts w:ascii="Century Gothic" w:hAnsi="Century Gothic"/>
+                <w:rFonts w:asciiTheme="minorHAnsi" w:hAnsiTheme="minorHAnsi" w:cstheme="minorHAnsi"/>
                 <w:b/>
                 <w:bCs/>
                 <w:color w:val="3B3838" w:themeColor="background2" w:themeShade="40"/>
@@ -4279,7 +4278,7 @@
             <w:pPr>
               <w:pStyle w:val="p1"/>
               <w:rPr>
-                <w:rFonts w:ascii="Century Gothic" w:hAnsi="Century Gothic"/>
+                <w:rFonts w:asciiTheme="minorHAnsi" w:hAnsiTheme="minorHAnsi" w:cstheme="minorHAnsi"/>
                 <w:b/>
                 <w:bCs/>
                 <w:color w:val="3B3838" w:themeColor="background2" w:themeShade="40"/>
@@ -4298,7 +4297,7 @@
             <w:pPr>
               <w:pStyle w:val="p1"/>
               <w:rPr>
-                <w:rFonts w:ascii="Century Gothic" w:hAnsi="Century Gothic"/>
+                <w:rFonts w:asciiTheme="minorHAnsi" w:hAnsiTheme="minorHAnsi" w:cstheme="minorHAnsi"/>
                 <w:b/>
                 <w:bCs/>
                 <w:color w:val="3B3838" w:themeColor="background2" w:themeShade="40"/>
@@ -4317,7 +4316,7 @@
             <w:pPr>
               <w:pStyle w:val="p1"/>
               <w:rPr>
-                <w:rFonts w:ascii="Century Gothic" w:hAnsi="Century Gothic"/>
+                <w:rFonts w:asciiTheme="minorHAnsi" w:hAnsiTheme="minorHAnsi" w:cstheme="minorHAnsi"/>
                 <w:b/>
                 <w:bCs/>
                 <w:color w:val="3B3838" w:themeColor="background2" w:themeShade="40"/>
@@ -4333,15 +4332,17 @@
     <w:p>
       <w:pPr>
         <w:rPr>
+          <w:rFonts w:cstheme="minorHAnsi"/>
           <w:rtl/>
         </w:rPr>
       </w:pPr>
       <w:r>
         <w:rPr>
+          <w:rFonts w:cstheme="minorHAnsi"/>
           <w:noProof/>
         </w:rPr>
         <w:drawing>
-          <wp:inline distT="0" distB="0" distL="0" distR="0" wp14:anchorId="3A5B6583" wp14:editId="1953702F">
+          <wp:inline distT="0" distB="0" distL="0" distR="0" wp14:anchorId="3A5B6583" wp14:editId="66820830">
             <wp:extent cx="7247467" cy="4076700"/>
             <wp:effectExtent l="0" t="0" r="0" b="0"/>
             <wp:docPr id="1716756076" name="Picture 1"/>
@@ -4393,6 +4394,7 @@
     <w:p>
       <w:pPr>
         <w:rPr>
+          <w:rFonts w:cstheme="minorHAnsi"/>
           <w:rtl/>
         </w:rPr>
       </w:pPr>
@@ -4400,15 +4402,17 @@
     <w:p>
       <w:pPr>
         <w:rPr>
+          <w:rFonts w:cstheme="minorHAnsi"/>
           <w:rtl/>
         </w:rPr>
       </w:pPr>
       <w:r>
         <w:rPr>
+          <w:rFonts w:cstheme="minorHAnsi"/>
           <w:noProof/>
         </w:rPr>
         <w:drawing>
-          <wp:inline distT="0" distB="0" distL="0" distR="0" wp14:anchorId="21F6F003" wp14:editId="5FFD73E1">
+          <wp:inline distT="0" distB="0" distL="0" distR="0" wp14:anchorId="21F6F003" wp14:editId="133800C4">
             <wp:extent cx="7230533" cy="4067175"/>
             <wp:effectExtent l="0" t="0" r="8890" b="0"/>
             <wp:docPr id="120970790" name="Picture 2"/>
@@ -4460,6 +4464,7 @@
     <w:p>
       <w:pPr>
         <w:rPr>
+          <w:rFonts w:cstheme="minorHAnsi"/>
           <w:rtl/>
         </w:rPr>
       </w:pPr>
@@ -4467,16 +4472,18 @@
     <w:p>
       <w:pPr>
         <w:rPr>
+          <w:rFonts w:cstheme="minorHAnsi"/>
           <w:rtl/>
         </w:rPr>
       </w:pPr>
       <w:r>
         <w:rPr>
+          <w:rFonts w:cstheme="minorHAnsi"/>
           <w:noProof/>
         </w:rPr>
         <w:lastRenderedPageBreak/>
         <w:drawing>
-          <wp:inline distT="0" distB="0" distL="0" distR="0" wp14:anchorId="012404A5" wp14:editId="0D7F1962">
+          <wp:inline distT="0" distB="0" distL="0" distR="0" wp14:anchorId="012404A5" wp14:editId="72E9ED0D">
             <wp:extent cx="7264400" cy="4086225"/>
             <wp:effectExtent l="0" t="0" r="0" b="9525"/>
             <wp:docPr id="1827178703" name="Picture 3"/>
@@ -4528,6 +4535,7 @@
     <w:p>
       <w:pPr>
         <w:rPr>
+          <w:rFonts w:cstheme="minorHAnsi"/>
           <w:rtl/>
         </w:rPr>
       </w:pPr>
@@ -4535,15 +4543,17 @@
     <w:p>
       <w:pPr>
         <w:rPr>
+          <w:rFonts w:cstheme="minorHAnsi"/>
           <w:rtl/>
         </w:rPr>
       </w:pPr>
       <w:r>
         <w:rPr>
+          <w:rFonts w:cstheme="minorHAnsi"/>
           <w:noProof/>
         </w:rPr>
         <w:drawing>
-          <wp:inline distT="0" distB="0" distL="0" distR="0" wp14:anchorId="6029C3D2" wp14:editId="0629D28D">
+          <wp:inline distT="0" distB="0" distL="0" distR="0" wp14:anchorId="6029C3D2" wp14:editId="29F3394C">
             <wp:extent cx="7247467" cy="4076700"/>
             <wp:effectExtent l="0" t="0" r="0" b="0"/>
             <wp:docPr id="1757524877" name="Picture 4"/>
@@ -4595,6 +4605,7 @@
     <w:p>
       <w:pPr>
         <w:rPr>
+          <w:rFonts w:cstheme="minorHAnsi"/>
           <w:rtl/>
         </w:rPr>
       </w:pPr>
@@ -4602,16 +4613,18 @@
     <w:p>
       <w:pPr>
         <w:rPr>
+          <w:rFonts w:cstheme="minorHAnsi"/>
           <w:rtl/>
         </w:rPr>
       </w:pPr>
       <w:r>
         <w:rPr>
+          <w:rFonts w:cstheme="minorHAnsi"/>
           <w:noProof/>
         </w:rPr>
         <w:lastRenderedPageBreak/>
         <w:drawing>
-          <wp:inline distT="0" distB="0" distL="0" distR="0" wp14:anchorId="3B4EA628" wp14:editId="03BD09B3">
+          <wp:inline distT="0" distB="0" distL="0" distR="0" wp14:anchorId="3B4EA628" wp14:editId="0CC62E84">
             <wp:extent cx="7179733" cy="4038600"/>
             <wp:effectExtent l="0" t="0" r="2540" b="0"/>
             <wp:docPr id="954667635" name="Picture 5"/>
@@ -4663,6 +4676,7 @@
     <w:p>
       <w:pPr>
         <w:rPr>
+          <w:rFonts w:cstheme="minorHAnsi"/>
           <w:rtl/>
         </w:rPr>
       </w:pPr>
@@ -4670,15 +4684,17 @@
     <w:p>
       <w:pPr>
         <w:rPr>
+          <w:rFonts w:cstheme="minorHAnsi"/>
           <w:rtl/>
         </w:rPr>
       </w:pPr>
       <w:r>
         <w:rPr>
+          <w:rFonts w:cstheme="minorHAnsi"/>
           <w:noProof/>
         </w:rPr>
         <w:drawing>
-          <wp:inline distT="0" distB="0" distL="0" distR="0" wp14:anchorId="471EB16D" wp14:editId="3CAAE918">
+          <wp:inline distT="0" distB="0" distL="0" distR="0" wp14:anchorId="471EB16D" wp14:editId="68B1EC61">
             <wp:extent cx="7179733" cy="4038600"/>
             <wp:effectExtent l="0" t="0" r="2540" b="0"/>
             <wp:docPr id="1858551207" name="Picture 6"/>
@@ -4730,6 +4746,7 @@
     <w:p>
       <w:pPr>
         <w:rPr>
+          <w:rFonts w:cstheme="minorHAnsi"/>
           <w:rtl/>
         </w:rPr>
       </w:pPr>
@@ -4737,16 +4754,18 @@
     <w:p>
       <w:pPr>
         <w:rPr>
+          <w:rFonts w:cstheme="minorHAnsi"/>
           <w:rtl/>
         </w:rPr>
       </w:pPr>
       <w:r>
         <w:rPr>
+          <w:rFonts w:cstheme="minorHAnsi"/>
           <w:noProof/>
         </w:rPr>
         <w:lastRenderedPageBreak/>
         <w:drawing>
-          <wp:inline distT="0" distB="0" distL="0" distR="0" wp14:anchorId="4B5E7549" wp14:editId="2A1D2F43">
+          <wp:inline distT="0" distB="0" distL="0" distR="0" wp14:anchorId="4B5E7549" wp14:editId="7AB76530">
             <wp:extent cx="7179733" cy="4038600"/>
             <wp:effectExtent l="0" t="0" r="2540" b="0"/>
             <wp:docPr id="988363635" name="Picture 7"/>
@@ -4798,6 +4817,7 @@
     <w:p>
       <w:pPr>
         <w:rPr>
+          <w:rFonts w:cstheme="minorHAnsi"/>
           <w:rtl/>
         </w:rPr>
       </w:pPr>
@@ -4805,15 +4825,17 @@
     <w:p>
       <w:pPr>
         <w:rPr>
+          <w:rFonts w:cstheme="minorHAnsi"/>
           <w:rtl/>
         </w:rPr>
       </w:pPr>
       <w:r>
         <w:rPr>
+          <w:rFonts w:cstheme="minorHAnsi"/>
           <w:noProof/>
         </w:rPr>
         <w:drawing>
-          <wp:inline distT="0" distB="0" distL="0" distR="0" wp14:anchorId="2513AE7F" wp14:editId="425AA29D">
+          <wp:inline distT="0" distB="0" distL="0" distR="0" wp14:anchorId="2513AE7F" wp14:editId="44C5FE3E">
             <wp:extent cx="7196667" cy="4048125"/>
             <wp:effectExtent l="0" t="0" r="4445" b="0"/>
             <wp:docPr id="1191533787" name="Picture 8"/>
@@ -4865,18 +4887,25 @@
     <w:p>
       <w:pPr>
         <w:rPr>
+          <w:rFonts w:cstheme="minorHAnsi"/>
           <w:rtl/>
         </w:rPr>
       </w:pPr>
     </w:p>
     <w:p>
+      <w:pPr>
+        <w:rPr>
+          <w:rFonts w:cstheme="minorHAnsi"/>
+        </w:rPr>
+      </w:pPr>
       <w:r>
         <w:rPr>
+          <w:rFonts w:cstheme="minorHAnsi"/>
           <w:noProof/>
         </w:rPr>
         <w:lastRenderedPageBreak/>
         <w:drawing>
-          <wp:inline distT="0" distB="0" distL="0" distR="0" wp14:anchorId="7248638A" wp14:editId="1A40C88E">
+          <wp:inline distT="0" distB="0" distL="0" distR="0" wp14:anchorId="7248638A" wp14:editId="24B166EB">
             <wp:extent cx="7230533" cy="4067175"/>
             <wp:effectExtent l="0" t="0" r="8890" b="0"/>
             <wp:docPr id="935556924" name="Picture 9"/>
@@ -5250,6 +5279,231 @@
     </w:lvl>
   </w:abstractNum>
   <w:abstractNum w:abstractNumId="2" w15:restartNumberingAfterBreak="0">
+    <w:nsid w:val="2FDE1399"/>
+    <w:multiLevelType w:val="hybridMultilevel"/>
+    <w:tmpl w:val="06EE5362"/>
+    <w:lvl w:ilvl="0" w:tplc="8D101A52">
+      <w:numFmt w:val="bullet"/>
+      <w:lvlText w:val=""/>
+      <w:lvlJc w:val="left"/>
+      <w:pPr>
+        <w:ind w:left="720" w:hanging="360"/>
+      </w:pPr>
+      <w:rPr>
+        <w:rFonts w:ascii="Calibri" w:eastAsiaTheme="minorHAnsi" w:hAnsi="Calibri" w:cs="Calibri" w:hint="default"/>
+      </w:rPr>
+    </w:lvl>
+    <w:lvl w:ilvl="1" w:tplc="04090003" w:tentative="1">
+      <w:start w:val="1"/>
+      <w:numFmt w:val="bullet"/>
+      <w:lvlText w:val="o"/>
+      <w:lvlJc w:val="left"/>
+      <w:pPr>
+        <w:ind w:left="1440" w:hanging="360"/>
+      </w:pPr>
+      <w:rPr>
+        <w:rFonts w:ascii="Courier New" w:hAnsi="Courier New" w:cs="Courier New" w:hint="default"/>
+      </w:rPr>
+    </w:lvl>
+    <w:lvl w:ilvl="2" w:tplc="04090005" w:tentative="1">
+      <w:start w:val="1"/>
+      <w:numFmt w:val="bullet"/>
+      <w:lvlText w:val=""/>
+      <w:lvlJc w:val="left"/>
+      <w:pPr>
+        <w:ind w:left="2160" w:hanging="360"/>
+      </w:pPr>
+      <w:rPr>
+        <w:rFonts w:ascii="Wingdings" w:hAnsi="Wingdings" w:hint="default"/>
+      </w:rPr>
+    </w:lvl>
+    <w:lvl w:ilvl="3" w:tplc="04090001" w:tentative="1">
+      <w:start w:val="1"/>
+      <w:numFmt w:val="bullet"/>
+      <w:lvlText w:val=""/>
+      <w:lvlJc w:val="left"/>
+      <w:pPr>
+        <w:ind w:left="2880" w:hanging="360"/>
+      </w:pPr>
+      <w:rPr>
+        <w:rFonts w:ascii="Symbol" w:hAnsi="Symbol" w:hint="default"/>
+      </w:rPr>
+    </w:lvl>
+    <w:lvl w:ilvl="4" w:tplc="04090003" w:tentative="1">
+      <w:start w:val="1"/>
+      <w:numFmt w:val="bullet"/>
+      <w:lvlText w:val="o"/>
+      <w:lvlJc w:val="left"/>
+      <w:pPr>
+        <w:ind w:left="3600" w:hanging="360"/>
+      </w:pPr>
+      <w:rPr>
+        <w:rFonts w:ascii="Courier New" w:hAnsi="Courier New" w:cs="Courier New" w:hint="default"/>
+      </w:rPr>
+    </w:lvl>
+    <w:lvl w:ilvl="5" w:tplc="04090005" w:tentative="1">
+      <w:start w:val="1"/>
+      <w:numFmt w:val="bullet"/>
+      <w:lvlText w:val=""/>
+      <w:lvlJc w:val="left"/>
+      <w:pPr>
+        <w:ind w:left="4320" w:hanging="360"/>
+      </w:pPr>
+      <w:rPr>
+        <w:rFonts w:ascii="Wingdings" w:hAnsi="Wingdings" w:hint="default"/>
+      </w:rPr>
+    </w:lvl>
+    <w:lvl w:ilvl="6" w:tplc="04090001" w:tentative="1">
+      <w:start w:val="1"/>
+      <w:numFmt w:val="bullet"/>
+      <w:lvlText w:val=""/>
+      <w:lvlJc w:val="left"/>
+      <w:pPr>
+        <w:ind w:left="5040" w:hanging="360"/>
+      </w:pPr>
+      <w:rPr>
+        <w:rFonts w:ascii="Symbol" w:hAnsi="Symbol" w:hint="default"/>
+      </w:rPr>
+    </w:lvl>
+    <w:lvl w:ilvl="7" w:tplc="04090003" w:tentative="1">
+      <w:start w:val="1"/>
+      <w:numFmt w:val="bullet"/>
+      <w:lvlText w:val="o"/>
+      <w:lvlJc w:val="left"/>
+      <w:pPr>
+        <w:ind w:left="5760" w:hanging="360"/>
+      </w:pPr>
+      <w:rPr>
+        <w:rFonts w:ascii="Courier New" w:hAnsi="Courier New" w:cs="Courier New" w:hint="default"/>
+      </w:rPr>
+    </w:lvl>
+    <w:lvl w:ilvl="8" w:tplc="04090005" w:tentative="1">
+      <w:start w:val="1"/>
+      <w:numFmt w:val="bullet"/>
+      <w:lvlText w:val=""/>
+      <w:lvlJc w:val="left"/>
+      <w:pPr>
+        <w:ind w:left="6480" w:hanging="360"/>
+      </w:pPr>
+      <w:rPr>
+        <w:rFonts w:ascii="Wingdings" w:hAnsi="Wingdings" w:hint="default"/>
+      </w:rPr>
+    </w:lvl>
+  </w:abstractNum>
+  <w:abstractNum w:abstractNumId="3" w15:restartNumberingAfterBreak="0">
+    <w:nsid w:val="324A0B44"/>
+    <w:multiLevelType w:val="hybridMultilevel"/>
+    <w:tmpl w:val="E2767B5C"/>
+    <w:lvl w:ilvl="0" w:tplc="04090001">
+      <w:start w:val="1"/>
+      <w:numFmt w:val="bullet"/>
+      <w:lvlText w:val=""/>
+      <w:lvlJc w:val="left"/>
+      <w:pPr>
+        <w:ind w:left="720" w:hanging="360"/>
+      </w:pPr>
+      <w:rPr>
+        <w:rFonts w:ascii="Symbol" w:hAnsi="Symbol" w:hint="default"/>
+      </w:rPr>
+    </w:lvl>
+    <w:lvl w:ilvl="1" w:tplc="04090003" w:tentative="1">
+      <w:start w:val="1"/>
+      <w:numFmt w:val="bullet"/>
+      <w:lvlText w:val="o"/>
+      <w:lvlJc w:val="left"/>
+      <w:pPr>
+        <w:ind w:left="1440" w:hanging="360"/>
+      </w:pPr>
+      <w:rPr>
+        <w:rFonts w:ascii="Courier New" w:hAnsi="Courier New" w:cs="Courier New" w:hint="default"/>
+      </w:rPr>
+    </w:lvl>
+    <w:lvl w:ilvl="2" w:tplc="04090005" w:tentative="1">
+      <w:start w:val="1"/>
+      <w:numFmt w:val="bullet"/>
+      <w:lvlText w:val=""/>
+      <w:lvlJc w:val="left"/>
+      <w:pPr>
+        <w:ind w:left="2160" w:hanging="360"/>
+      </w:pPr>
+      <w:rPr>
+        <w:rFonts w:ascii="Wingdings" w:hAnsi="Wingdings" w:hint="default"/>
+      </w:rPr>
+    </w:lvl>
+    <w:lvl w:ilvl="3" w:tplc="04090001" w:tentative="1">
+      <w:start w:val="1"/>
+      <w:numFmt w:val="bullet"/>
+      <w:lvlText w:val=""/>
+      <w:lvlJc w:val="left"/>
+      <w:pPr>
+        <w:ind w:left="2880" w:hanging="360"/>
+      </w:pPr>
+      <w:rPr>
+        <w:rFonts w:ascii="Symbol" w:hAnsi="Symbol" w:hint="default"/>
+      </w:rPr>
+    </w:lvl>
+    <w:lvl w:ilvl="4" w:tplc="04090003" w:tentative="1">
+      <w:start w:val="1"/>
+      <w:numFmt w:val="bullet"/>
+      <w:lvlText w:val="o"/>
+      <w:lvlJc w:val="left"/>
+      <w:pPr>
+        <w:ind w:left="3600" w:hanging="360"/>
+      </w:pPr>
+      <w:rPr>
+        <w:rFonts w:ascii="Courier New" w:hAnsi="Courier New" w:cs="Courier New" w:hint="default"/>
+      </w:rPr>
+    </w:lvl>
+    <w:lvl w:ilvl="5" w:tplc="04090005" w:tentative="1">
+      <w:start w:val="1"/>
+      <w:numFmt w:val="bullet"/>
+      <w:lvlText w:val=""/>
+      <w:lvlJc w:val="left"/>
+      <w:pPr>
+        <w:ind w:left="4320" w:hanging="360"/>
+      </w:pPr>
+      <w:rPr>
+        <w:rFonts w:ascii="Wingdings" w:hAnsi="Wingdings" w:hint="default"/>
+      </w:rPr>
+    </w:lvl>
+    <w:lvl w:ilvl="6" w:tplc="04090001" w:tentative="1">
+      <w:start w:val="1"/>
+      <w:numFmt w:val="bullet"/>
+      <w:lvlText w:val=""/>
+      <w:lvlJc w:val="left"/>
+      <w:pPr>
+        <w:ind w:left="5040" w:hanging="360"/>
+      </w:pPr>
+      <w:rPr>
+        <w:rFonts w:ascii="Symbol" w:hAnsi="Symbol" w:hint="default"/>
+      </w:rPr>
+    </w:lvl>
+    <w:lvl w:ilvl="7" w:tplc="04090003" w:tentative="1">
+      <w:start w:val="1"/>
+      <w:numFmt w:val="bullet"/>
+      <w:lvlText w:val="o"/>
+      <w:lvlJc w:val="left"/>
+      <w:pPr>
+        <w:ind w:left="5760" w:hanging="360"/>
+      </w:pPr>
+      <w:rPr>
+        <w:rFonts w:ascii="Courier New" w:hAnsi="Courier New" w:cs="Courier New" w:hint="default"/>
+      </w:rPr>
+    </w:lvl>
+    <w:lvl w:ilvl="8" w:tplc="04090005" w:tentative="1">
+      <w:start w:val="1"/>
+      <w:numFmt w:val="bullet"/>
+      <w:lvlText w:val=""/>
+      <w:lvlJc w:val="left"/>
+      <w:pPr>
+        <w:ind w:left="6480" w:hanging="360"/>
+      </w:pPr>
+      <w:rPr>
+        <w:rFonts w:ascii="Wingdings" w:hAnsi="Wingdings" w:hint="default"/>
+      </w:rPr>
+    </w:lvl>
+  </w:abstractNum>
+  <w:abstractNum w:abstractNumId="4" w15:restartNumberingAfterBreak="0">
     <w:nsid w:val="4020433A"/>
     <w:multiLevelType w:val="hybridMultilevel"/>
     <w:tmpl w:val="8A6269E8"/>
@@ -5362,7 +5616,7 @@
       </w:rPr>
     </w:lvl>
   </w:abstractNum>
-  <w:abstractNum w:abstractNumId="3" w15:restartNumberingAfterBreak="0">
+  <w:abstractNum w:abstractNumId="5" w15:restartNumberingAfterBreak="0">
     <w:nsid w:val="43F00A41"/>
     <w:multiLevelType w:val="hybridMultilevel"/>
     <w:tmpl w:val="2B2A5352"/>
@@ -5475,7 +5729,7 @@
       </w:rPr>
     </w:lvl>
   </w:abstractNum>
-  <w:abstractNum w:abstractNumId="4" w15:restartNumberingAfterBreak="0">
+  <w:abstractNum w:abstractNumId="6" w15:restartNumberingAfterBreak="0">
     <w:nsid w:val="4446011E"/>
     <w:multiLevelType w:val="hybridMultilevel"/>
     <w:tmpl w:val="23583476"/>
@@ -5588,7 +5842,7 @@
       </w:rPr>
     </w:lvl>
   </w:abstractNum>
-  <w:abstractNum w:abstractNumId="5" w15:restartNumberingAfterBreak="0">
+  <w:abstractNum w:abstractNumId="7" w15:restartNumberingAfterBreak="0">
     <w:nsid w:val="4B17656D"/>
     <w:multiLevelType w:val="hybridMultilevel"/>
     <w:tmpl w:val="B57E28F6"/>
@@ -5701,7 +5955,119 @@
       </w:rPr>
     </w:lvl>
   </w:abstractNum>
-  <w:abstractNum w:abstractNumId="6" w15:restartNumberingAfterBreak="0">
+  <w:abstractNum w:abstractNumId="8" w15:restartNumberingAfterBreak="0">
+    <w:nsid w:val="54F57F0E"/>
+    <w:multiLevelType w:val="hybridMultilevel"/>
+    <w:tmpl w:val="3ADC6890"/>
+    <w:lvl w:ilvl="0" w:tplc="8D101A52">
+      <w:numFmt w:val="bullet"/>
+      <w:lvlText w:val=""/>
+      <w:lvlJc w:val="left"/>
+      <w:pPr>
+        <w:ind w:left="720" w:hanging="360"/>
+      </w:pPr>
+      <w:rPr>
+        <w:rFonts w:ascii="Calibri" w:eastAsiaTheme="minorHAnsi" w:hAnsi="Calibri" w:cs="Calibri" w:hint="default"/>
+      </w:rPr>
+    </w:lvl>
+    <w:lvl w:ilvl="1" w:tplc="04090003" w:tentative="1">
+      <w:start w:val="1"/>
+      <w:numFmt w:val="bullet"/>
+      <w:lvlText w:val="o"/>
+      <w:lvlJc w:val="left"/>
+      <w:pPr>
+        <w:ind w:left="1440" w:hanging="360"/>
+      </w:pPr>
+      <w:rPr>
+        <w:rFonts w:ascii="Courier New" w:hAnsi="Courier New" w:cs="Courier New" w:hint="default"/>
+      </w:rPr>
+    </w:lvl>
+    <w:lvl w:ilvl="2" w:tplc="04090005" w:tentative="1">
+      <w:start w:val="1"/>
+      <w:numFmt w:val="bullet"/>
+      <w:lvlText w:val=""/>
+      <w:lvlJc w:val="left"/>
+      <w:pPr>
+        <w:ind w:left="2160" w:hanging="360"/>
+      </w:pPr>
+      <w:rPr>
+        <w:rFonts w:ascii="Wingdings" w:hAnsi="Wingdings" w:hint="default"/>
+      </w:rPr>
+    </w:lvl>
+    <w:lvl w:ilvl="3" w:tplc="04090001" w:tentative="1">
+      <w:start w:val="1"/>
+      <w:numFmt w:val="bullet"/>
+      <w:lvlText w:val=""/>
+      <w:lvlJc w:val="left"/>
+      <w:pPr>
+        <w:ind w:left="2880" w:hanging="360"/>
+      </w:pPr>
+      <w:rPr>
+        <w:rFonts w:ascii="Symbol" w:hAnsi="Symbol" w:hint="default"/>
+      </w:rPr>
+    </w:lvl>
+    <w:lvl w:ilvl="4" w:tplc="04090003" w:tentative="1">
+      <w:start w:val="1"/>
+      <w:numFmt w:val="bullet"/>
+      <w:lvlText w:val="o"/>
+      <w:lvlJc w:val="left"/>
+      <w:pPr>
+        <w:ind w:left="3600" w:hanging="360"/>
+      </w:pPr>
+      <w:rPr>
+        <w:rFonts w:ascii="Courier New" w:hAnsi="Courier New" w:cs="Courier New" w:hint="default"/>
+      </w:rPr>
+    </w:lvl>
+    <w:lvl w:ilvl="5" w:tplc="04090005" w:tentative="1">
+      <w:start w:val="1"/>
+      <w:numFmt w:val="bullet"/>
+      <w:lvlText w:val=""/>
+      <w:lvlJc w:val="left"/>
+      <w:pPr>
+        <w:ind w:left="4320" w:hanging="360"/>
+      </w:pPr>
+      <w:rPr>
+        <w:rFonts w:ascii="Wingdings" w:hAnsi="Wingdings" w:hint="default"/>
+      </w:rPr>
+    </w:lvl>
+    <w:lvl w:ilvl="6" w:tplc="04090001" w:tentative="1">
+      <w:start w:val="1"/>
+      <w:numFmt w:val="bullet"/>
+      <w:lvlText w:val=""/>
+      <w:lvlJc w:val="left"/>
+      <w:pPr>
+        <w:ind w:left="5040" w:hanging="360"/>
+      </w:pPr>
+      <w:rPr>
+        <w:rFonts w:ascii="Symbol" w:hAnsi="Symbol" w:hint="default"/>
+      </w:rPr>
+    </w:lvl>
+    <w:lvl w:ilvl="7" w:tplc="04090003" w:tentative="1">
+      <w:start w:val="1"/>
+      <w:numFmt w:val="bullet"/>
+      <w:lvlText w:val="o"/>
+      <w:lvlJc w:val="left"/>
+      <w:pPr>
+        <w:ind w:left="5760" w:hanging="360"/>
+      </w:pPr>
+      <w:rPr>
+        <w:rFonts w:ascii="Courier New" w:hAnsi="Courier New" w:cs="Courier New" w:hint="default"/>
+      </w:rPr>
+    </w:lvl>
+    <w:lvl w:ilvl="8" w:tplc="04090005" w:tentative="1">
+      <w:start w:val="1"/>
+      <w:numFmt w:val="bullet"/>
+      <w:lvlText w:val=""/>
+      <w:lvlJc w:val="left"/>
+      <w:pPr>
+        <w:ind w:left="6480" w:hanging="360"/>
+      </w:pPr>
+      <w:rPr>
+        <w:rFonts w:ascii="Wingdings" w:hAnsi="Wingdings" w:hint="default"/>
+      </w:rPr>
+    </w:lvl>
+  </w:abstractNum>
+  <w:abstractNum w:abstractNumId="9" w15:restartNumberingAfterBreak="0">
     <w:nsid w:val="76351533"/>
     <w:multiLevelType w:val="hybridMultilevel"/>
     <w:tmpl w:val="185CD406"/>
@@ -5814,7 +6180,7 @@
       </w:rPr>
     </w:lvl>
   </w:abstractNum>
-  <w:abstractNum w:abstractNumId="7" w15:restartNumberingAfterBreak="0">
+  <w:abstractNum w:abstractNumId="10" w15:restartNumberingAfterBreak="0">
     <w:nsid w:val="764623D3"/>
     <w:multiLevelType w:val="hybridMultilevel"/>
     <w:tmpl w:val="09A69656"/>
@@ -5928,28 +6294,37 @@
     </w:lvl>
   </w:abstractNum>
   <w:num w:numId="1" w16cid:durableId="1153910851">
-    <w:abstractNumId w:val="7"/>
+    <w:abstractNumId w:val="10"/>
   </w:num>
   <w:num w:numId="2" w16cid:durableId="599338481">
-    <w:abstractNumId w:val="3"/>
+    <w:abstractNumId w:val="5"/>
   </w:num>
   <w:num w:numId="3" w16cid:durableId="1630013764">
     <w:abstractNumId w:val="0"/>
   </w:num>
   <w:num w:numId="4" w16cid:durableId="736172365">
-    <w:abstractNumId w:val="5"/>
+    <w:abstractNumId w:val="7"/>
   </w:num>
   <w:num w:numId="5" w16cid:durableId="1833107530">
-    <w:abstractNumId w:val="4"/>
+    <w:abstractNumId w:val="6"/>
   </w:num>
   <w:num w:numId="6" w16cid:durableId="2132820859">
-    <w:abstractNumId w:val="6"/>
+    <w:abstractNumId w:val="9"/>
   </w:num>
   <w:num w:numId="7" w16cid:durableId="1541438487">
-    <w:abstractNumId w:val="2"/>
+    <w:abstractNumId w:val="4"/>
   </w:num>
   <w:num w:numId="8" w16cid:durableId="12078079">
     <w:abstractNumId w:val="1"/>
+  </w:num>
+  <w:num w:numId="9" w16cid:durableId="1906599033">
+    <w:abstractNumId w:val="3"/>
+  </w:num>
+  <w:num w:numId="10" w16cid:durableId="1097290595">
+    <w:abstractNumId w:val="2"/>
+  </w:num>
+  <w:num w:numId="11" w16cid:durableId="837306798">
+    <w:abstractNumId w:val="8"/>
   </w:num>
 </w:numbering>
 </file>

</xml_diff>